<commit_message>
Agregado calculo de importe total a docx
</commit_message>
<xml_diff>
--- a/back/utils/templates/templateDocsV2.docx
+++ b/back/utils/templates/templateDocsV2.docx
@@ -110,7 +110,7 @@
         </w:tblCellMar>
       </w:tblPr>
       <w:tblGrid>
-        <w:gridCol w:w="14566"/>
+        <w:gridCol w:w="14570"/>
       </w:tblGrid>
       <w:tr>
         <w:trPr>
@@ -118,7 +118,7 @@
         </w:trPr>
         <w:tc>
           <w:tcPr>
-            <w:tcW w:w="14566" w:type="dxa"/>
+            <w:tcW w:w="14570" w:type="dxa"/>
             <w:tcBorders>
               <w:top w:val="single" w:sz="4" w:space="0" w:color="000000"/>
               <w:start w:val="single" w:sz="4" w:space="0" w:color="000000"/>
@@ -1288,6 +1288,80 @@
         </w:rPr>
       </w:r>
     </w:p>
+    <w:tbl>
+      <w:tblPr>
+        <w:tblW w:w="8784" w:type="dxa"/>
+        <w:jc w:val="start"/>
+        <w:tblInd w:w="-5" w:type="dxa"/>
+        <w:tblLayout w:type="fixed"/>
+        <w:tblCellMar>
+          <w:top w:w="55" w:type="dxa"/>
+          <w:start w:w="55" w:type="dxa"/>
+          <w:bottom w:w="55" w:type="dxa"/>
+          <w:end w:w="55" w:type="dxa"/>
+        </w:tblCellMar>
+      </w:tblPr>
+      <w:tblGrid>
+        <w:gridCol w:w="3252"/>
+        <w:gridCol w:w="5532"/>
+      </w:tblGrid>
+      <w:tr>
+        <w:trPr/>
+        <w:tc>
+          <w:tcPr>
+            <w:tcW w:w="3252" w:type="dxa"/>
+            <w:tcBorders>
+              <w:top w:val="single" w:sz="4" w:space="0" w:color="000000"/>
+              <w:start w:val="single" w:sz="4" w:space="0" w:color="000000"/>
+              <w:bottom w:val="single" w:sz="4" w:space="0" w:color="000000"/>
+            </w:tcBorders>
+          </w:tcPr>
+          <w:p>
+            <w:pPr>
+              <w:pStyle w:val="TableContents"/>
+              <w:rPr/>
+            </w:pPr>
+            <w:r>
+              <w:rPr/>
+              <w:t>TOTAL</w:t>
+            </w:r>
+          </w:p>
+        </w:tc>
+        <w:tc>
+          <w:tcPr>
+            <w:tcW w:w="5532" w:type="dxa"/>
+            <w:tcBorders>
+              <w:top w:val="single" w:sz="4" w:space="0" w:color="000000"/>
+              <w:start w:val="single" w:sz="4" w:space="0" w:color="000000"/>
+              <w:bottom w:val="single" w:sz="4" w:space="0" w:color="000000"/>
+              <w:end w:val="single" w:sz="4" w:space="0" w:color="000000"/>
+            </w:tcBorders>
+          </w:tcPr>
+          <w:p>
+            <w:pPr>
+              <w:pStyle w:val="TableContents"/>
+              <w:rPr/>
+            </w:pPr>
+            <w:r>
+              <w:rPr/>
+              <w:t xml:space="preserve"> </w:t>
+            </w:r>
+            <w:r>
+              <w:rPr/>
+              <w:t xml:space="preserve">{{ </w:t>
+            </w:r>
+            <w:r>
+              <w:rPr/>
+              <w:t>importe_total</w:t>
+            </w:r>
+            <w:r>
+              <w:rPr/>
+              <w:t xml:space="preserve"> }}</w:t>
+            </w:r>
+          </w:p>
+        </w:tc>
+      </w:tr>
+    </w:tbl>
     <w:p>
       <w:pPr>
         <w:pStyle w:val="Normal"/>
@@ -1308,7 +1382,7 @@
     </w:p>
     <w:sectPr>
       <w:type w:val="nextPage"/>
-      <w:pgSz w:orient="landscape" w:w="16834" w:h="11909"/>
+      <w:pgSz w:orient="landscape" w:w="16838" w:h="11906"/>
       <w:pgMar w:left="1134" w:right="1134" w:gutter="0" w:header="0" w:top="562" w:footer="0" w:bottom="1134"/>
       <w:pgNumType w:fmt="decimal"/>
       <w:formProt w:val="false"/>
@@ -3127,37 +3201,37 @@
         <a:srgbClr val="000000"/>
       </a:dk1>
       <a:lt1>
-        <a:srgbClr val="ffffff"/>
+        <a:srgbClr val="FFFFFF"/>
       </a:lt1>
       <a:dk2>
         <a:srgbClr val="000000"/>
       </a:dk2>
       <a:lt2>
-        <a:srgbClr val="ffffff"/>
+        <a:srgbClr val="FFFFFF"/>
       </a:lt2>
       <a:accent1>
-        <a:srgbClr val="18a303"/>
+        <a:srgbClr val="18A303"/>
       </a:accent1>
       <a:accent2>
-        <a:srgbClr val="0369a3"/>
+        <a:srgbClr val="0369A3"/>
       </a:accent2>
       <a:accent3>
-        <a:srgbClr val="a33e03"/>
+        <a:srgbClr val="A33E03"/>
       </a:accent3>
       <a:accent4>
-        <a:srgbClr val="8e03a3"/>
+        <a:srgbClr val="8E03A3"/>
       </a:accent4>
       <a:accent5>
-        <a:srgbClr val="c99c00"/>
+        <a:srgbClr val="C99C00"/>
       </a:accent5>
       <a:accent6>
-        <a:srgbClr val="c9211e"/>
+        <a:srgbClr val="C9211E"/>
       </a:accent6>
       <a:hlink>
-        <a:srgbClr val="0000ee"/>
+        <a:srgbClr val="0000EE"/>
       </a:hlink>
       <a:folHlink>
-        <a:srgbClr val="551a8b"/>
+        <a:srgbClr val="551A8B"/>
       </a:folHlink>
     </a:clrScheme>
     <a:fontScheme name="Office">

</xml_diff>

<commit_message>
Agregado formateo de concepto/disco,  cambio a zip de descarga de documentos, nueva logica de generacion de archivos
</commit_message>
<xml_diff>
--- a/back/utils/templates/templateDocsV2.docx
+++ b/back/utils/templates/templateDocsV2.docx
@@ -141,10 +141,36 @@
                 <w:rFonts w:ascii="Times New Roman" w:hAnsi="Times New Roman"/>
                 <w:lang w:val="es-AR"/>
               </w:rPr>
-              <w:t>Concepto SUELDO.06-20</w:t>
+              <w:t xml:space="preserve">Concepto </w:t>
+            </w:r>
+            <w:r>
+              <w:rPr>
+                <w:rFonts w:ascii="Times New Roman" w:hAnsi="Times New Roman"/>
+                <w:lang w:val="es-AR"/>
+              </w:rPr>
+              <w:t>{{ concepto }}</w:t>
+            </w:r>
+            <w:r>
+              <w:rPr>
+                <w:rFonts w:ascii="Times New Roman" w:hAnsi="Times New Roman"/>
+                <w:lang w:val="es-AR"/>
+              </w:rPr>
               <w:tab/>
               <w:tab/>
-              <w:t>Disco Sueldo.06-20</w:t>
+              <w:t xml:space="preserve">Disco </w:t>
+            </w:r>
+            <w:r>
+              <w:rPr>
+                <w:rFonts w:ascii="Times New Roman" w:hAnsi="Times New Roman"/>
+                <w:lang w:val="es-AR"/>
+              </w:rPr>
+              <w:t>{{ concepto }}</w:t>
+            </w:r>
+            <w:r>
+              <w:rPr>
+                <w:rFonts w:ascii="Times New Roman" w:hAnsi="Times New Roman"/>
+                <w:lang w:val="es-AR"/>
+              </w:rPr>
               <w:tab/>
               <w:tab/>
               <w:t>Fecha de Pago 30/06/2026</w:t>
@@ -1302,14 +1328,14 @@
         </w:tblCellMar>
       </w:tblPr>
       <w:tblGrid>
-        <w:gridCol w:w="3252"/>
-        <w:gridCol w:w="5532"/>
+        <w:gridCol w:w="3251"/>
+        <w:gridCol w:w="5533"/>
       </w:tblGrid>
       <w:tr>
         <w:trPr/>
         <w:tc>
           <w:tcPr>
-            <w:tcW w:w="3252" w:type="dxa"/>
+            <w:tcW w:w="3251" w:type="dxa"/>
             <w:tcBorders>
               <w:top w:val="single" w:sz="4" w:space="0" w:color="000000"/>
               <w:start w:val="single" w:sz="4" w:space="0" w:color="000000"/>
@@ -1329,7 +1355,7 @@
         </w:tc>
         <w:tc>
           <w:tcPr>
-            <w:tcW w:w="5532" w:type="dxa"/>
+            <w:tcW w:w="5533" w:type="dxa"/>
             <w:tcBorders>
               <w:top w:val="single" w:sz="4" w:space="0" w:color="000000"/>
               <w:start w:val="single" w:sz="4" w:space="0" w:color="000000"/>
@@ -1348,15 +1374,7 @@
             </w:r>
             <w:r>
               <w:rPr/>
-              <w:t xml:space="preserve">{{ </w:t>
-            </w:r>
-            <w:r>
-              <w:rPr/>
-              <w:t>importe_total</w:t>
-            </w:r>
-            <w:r>
-              <w:rPr/>
-              <w:t xml:space="preserve"> }}</w:t>
+              <w:t>{{ importe_total }}</w:t>
             </w:r>
           </w:p>
         </w:tc>

</xml_diff>

<commit_message>
Mejorado formateo de DOCX, agregado disco y fecha de baja a excel
</commit_message>
<xml_diff>
--- a/back/utils/templates/templateDocsV2.docx
+++ b/back/utils/templates/templateDocsV2.docx
@@ -27,7 +27,7 @@
           <w:szCs w:val="48"/>
           <w:lang w:val="es-AR"/>
         </w:rPr>
-        <w:t>MINISTERIO DE EDUCACION</w:t>
+        <w:t>MINISTERIO DE EDUCACIÓN</w:t>
       </w:r>
     </w:p>
     <w:p>
@@ -53,7 +53,7 @@
           <w:szCs w:val="32"/>
           <w:lang w:val="es-AR"/>
         </w:rPr>
-        <w:t>Secretaria Administrativa Financiera</w:t>
+        <w:t>Secretaría Administrativa Financiera</w:t>
       </w:r>
     </w:p>
     <w:p>
@@ -110,7 +110,9 @@
         </w:tblCellMar>
       </w:tblPr>
       <w:tblGrid>
-        <w:gridCol w:w="14570"/>
+        <w:gridCol w:w="4856"/>
+        <w:gridCol w:w="4857"/>
+        <w:gridCol w:w="4857"/>
       </w:tblGrid>
       <w:tr>
         <w:trPr>
@@ -118,11 +120,91 @@
         </w:trPr>
         <w:tc>
           <w:tcPr>
-            <w:tcW w:w="14570" w:type="dxa"/>
+            <w:tcW w:w="4856" w:type="dxa"/>
             <w:tcBorders>
               <w:top w:val="single" w:sz="4" w:space="0" w:color="000000"/>
               <w:start w:val="single" w:sz="4" w:space="0" w:color="000000"/>
               <w:bottom w:val="single" w:sz="4" w:space="0" w:color="000000"/>
+            </w:tcBorders>
+          </w:tcPr>
+          <w:p>
+            <w:pPr>
+              <w:pStyle w:val="Normal"/>
+              <w:bidi w:val="0"/>
+              <w:spacing w:lineRule="auto" w:line="240" w:before="0" w:after="0"/>
+              <w:jc w:val="start"/>
+              <w:rPr>
+                <w:sz w:val="22"/>
+                <w:szCs w:val="22"/>
+              </w:rPr>
+            </w:pPr>
+            <w:r>
+              <w:rPr>
+                <w:rFonts w:ascii="Times New Roman" w:hAnsi="Times New Roman"/>
+                <w:b/>
+                <w:bCs/>
+                <w:sz w:val="22"/>
+                <w:szCs w:val="22"/>
+                <w:lang w:val="es-AR"/>
+              </w:rPr>
+              <w:t>Concepto</w:t>
+            </w:r>
+            <w:r>
+              <w:rPr>
+                <w:rFonts w:ascii="Times New Roman" w:hAnsi="Times New Roman"/>
+                <w:sz w:val="22"/>
+                <w:szCs w:val="22"/>
+                <w:lang w:val="es-AR"/>
+              </w:rPr>
+              <w:t xml:space="preserve"> {{ concepto }}</w:t>
+            </w:r>
+          </w:p>
+        </w:tc>
+        <w:tc>
+          <w:tcPr>
+            <w:tcW w:w="4857" w:type="dxa"/>
+            <w:tcBorders>
+              <w:top w:val="single" w:sz="4" w:space="0" w:color="000000"/>
+              <w:bottom w:val="single" w:sz="4" w:space="0" w:color="000000"/>
+            </w:tcBorders>
+          </w:tcPr>
+          <w:p>
+            <w:pPr>
+              <w:pStyle w:val="Normal"/>
+              <w:bidi w:val="0"/>
+              <w:spacing w:lineRule="auto" w:line="240" w:before="0" w:after="0"/>
+              <w:jc w:val="start"/>
+              <w:rPr>
+                <w:sz w:val="22"/>
+                <w:szCs w:val="22"/>
+              </w:rPr>
+            </w:pPr>
+            <w:r>
+              <w:rPr>
+                <w:b/>
+                <w:bCs/>
+                <w:sz w:val="22"/>
+                <w:szCs w:val="22"/>
+                <w:lang w:val="es-AR"/>
+              </w:rPr>
+              <w:t>Disco</w:t>
+            </w:r>
+            <w:r>
+              <w:rPr>
+                <w:sz w:val="22"/>
+                <w:szCs w:val="22"/>
+                <w:lang w:val="es-AR"/>
+              </w:rPr>
+              <w:t xml:space="preserve"> {{ concepto }}</w:t>
+            </w:r>
+          </w:p>
+        </w:tc>
+        <w:tc>
+          <w:tcPr>
+            <w:tcW w:w="4857" w:type="dxa"/>
+            <w:tcBorders>
+              <w:top w:val="single" w:sz="4" w:space="0" w:color="000000"/>
+              <w:bottom w:val="single" w:sz="4" w:space="0" w:color="000000"/>
               <w:end w:val="single" w:sz="4" w:space="0" w:color="000000"/>
             </w:tcBorders>
           </w:tcPr>
@@ -133,47 +215,27 @@
               <w:spacing w:lineRule="auto" w:line="240" w:before="0" w:after="0"/>
               <w:jc w:val="start"/>
               <w:rPr>
-                <w:rFonts w:ascii="Times New Roman" w:hAnsi="Times New Roman"/>
-              </w:rPr>
-            </w:pPr>
-            <w:r>
-              <w:rPr>
-                <w:rFonts w:ascii="Times New Roman" w:hAnsi="Times New Roman"/>
+                <w:sz w:val="22"/>
+                <w:szCs w:val="22"/>
+              </w:rPr>
+            </w:pPr>
+            <w:r>
+              <w:rPr>
+                <w:b/>
+                <w:bCs/>
+                <w:sz w:val="22"/>
+                <w:szCs w:val="22"/>
                 <w:lang w:val="es-AR"/>
               </w:rPr>
-              <w:t xml:space="preserve">Concepto </w:t>
-            </w:r>
-            <w:r>
-              <w:rPr>
-                <w:rFonts w:ascii="Times New Roman" w:hAnsi="Times New Roman"/>
+              <w:t>Fecha de Pago</w:t>
+            </w:r>
+            <w:r>
+              <w:rPr>
+                <w:sz w:val="22"/>
+                <w:szCs w:val="22"/>
                 <w:lang w:val="es-AR"/>
               </w:rPr>
-              <w:t>{{ concepto }}</w:t>
-            </w:r>
-            <w:r>
-              <w:rPr>
-                <w:rFonts w:ascii="Times New Roman" w:hAnsi="Times New Roman"/>
-                <w:lang w:val="es-AR"/>
-              </w:rPr>
-              <w:tab/>
-              <w:tab/>
-              <w:t xml:space="preserve">Disco </w:t>
-            </w:r>
-            <w:r>
-              <w:rPr>
-                <w:rFonts w:ascii="Times New Roman" w:hAnsi="Times New Roman"/>
-                <w:lang w:val="es-AR"/>
-              </w:rPr>
-              <w:t>{{ concepto }}</w:t>
-            </w:r>
-            <w:r>
-              <w:rPr>
-                <w:rFonts w:ascii="Times New Roman" w:hAnsi="Times New Roman"/>
-                <w:lang w:val="es-AR"/>
-              </w:rPr>
-              <w:tab/>
-              <w:tab/>
-              <w:t>Fecha de Pago 30/06/2026</w:t>
+              <w:t xml:space="preserve"> 30/06/2026</w:t>
             </w:r>
           </w:p>
         </w:tc>
@@ -241,9 +303,39 @@
               <w:bidi w:val="0"/>
               <w:jc w:val="start"/>
               <w:rPr>
+                <w:sz w:val="22"/>
+                <w:szCs w:val="22"/>
+              </w:rPr>
+            </w:pPr>
+            <w:r>
+              <w:rPr>
                 <w:rFonts w:ascii="Times New Roman" w:hAnsi="Times New Roman"/>
                 <w:b/>
                 <w:bCs/>
+                <w:sz w:val="22"/>
+                <w:szCs w:val="22"/>
+              </w:rPr>
+              <w:t>Nro. de Padron</w:t>
+            </w:r>
+          </w:p>
+        </w:tc>
+        <w:tc>
+          <w:tcPr>
+            <w:tcW w:w="2698" w:type="dxa"/>
+            <w:tcBorders>
+              <w:top w:val="single" w:sz="4" w:space="0" w:color="000000"/>
+              <w:start w:val="single" w:sz="4" w:space="0" w:color="000000"/>
+              <w:bottom w:val="single" w:sz="4" w:space="0" w:color="000000"/>
+            </w:tcBorders>
+          </w:tcPr>
+          <w:p>
+            <w:pPr>
+              <w:pStyle w:val="TableContents"/>
+              <w:bidi w:val="0"/>
+              <w:jc w:val="start"/>
+              <w:rPr>
+                <w:sz w:val="22"/>
+                <w:szCs w:val="22"/>
               </w:rPr>
             </w:pPr>
             <w:r>
@@ -251,16 +343,16 @@
                 <w:rFonts w:ascii="Times New Roman" w:hAnsi="Times New Roman"/>
                 <w:b/>
                 <w:bCs/>
-                <w:sz w:val="24"/>
-                <w:szCs w:val="24"/>
-              </w:rPr>
-              <w:t>Nro. de Padron</w:t>
-            </w:r>
-          </w:p>
-        </w:tc>
-        <w:tc>
-          <w:tcPr>
-            <w:tcW w:w="2698" w:type="dxa"/>
+                <w:sz w:val="22"/>
+                <w:szCs w:val="22"/>
+              </w:rPr>
+              <w:t>Apellido y nombre</w:t>
+            </w:r>
+          </w:p>
+        </w:tc>
+        <w:tc>
+          <w:tcPr>
+            <w:tcW w:w="1537" w:type="dxa"/>
             <w:tcBorders>
               <w:top w:val="single" w:sz="4" w:space="0" w:color="000000"/>
               <w:start w:val="single" w:sz="4" w:space="0" w:color="000000"/>
@@ -272,10 +364,40 @@
               <w:pStyle w:val="TableContents"/>
               <w:bidi w:val="0"/>
               <w:jc w:val="start"/>
+              <w:rPr>
+                <w:sz w:val="22"/>
+                <w:szCs w:val="22"/>
+              </w:rPr>
+            </w:pPr>
+            <w:r>
               <w:rPr>
                 <w:rFonts w:ascii="Times New Roman" w:hAnsi="Times New Roman"/>
                 <w:b/>
                 <w:bCs/>
+                <w:sz w:val="22"/>
+                <w:szCs w:val="22"/>
+              </w:rPr>
+              <w:t>Importe</w:t>
+            </w:r>
+          </w:p>
+        </w:tc>
+        <w:tc>
+          <w:tcPr>
+            <w:tcW w:w="1345" w:type="dxa"/>
+            <w:tcBorders>
+              <w:top w:val="single" w:sz="4" w:space="0" w:color="000000"/>
+              <w:start w:val="single" w:sz="4" w:space="0" w:color="000000"/>
+              <w:bottom w:val="single" w:sz="4" w:space="0" w:color="000000"/>
+            </w:tcBorders>
+          </w:tcPr>
+          <w:p>
+            <w:pPr>
+              <w:pStyle w:val="TableContents"/>
+              <w:bidi w:val="0"/>
+              <w:jc w:val="start"/>
+              <w:rPr>
+                <w:sz w:val="22"/>
+                <w:szCs w:val="22"/>
               </w:rPr>
             </w:pPr>
             <w:r>
@@ -283,16 +405,16 @@
                 <w:rFonts w:ascii="Times New Roman" w:hAnsi="Times New Roman"/>
                 <w:b/>
                 <w:bCs/>
-                <w:sz w:val="24"/>
-                <w:szCs w:val="24"/>
-              </w:rPr>
-              <w:t>Apellido y nombre</w:t>
-            </w:r>
-          </w:p>
-        </w:tc>
-        <w:tc>
-          <w:tcPr>
-            <w:tcW w:w="1537" w:type="dxa"/>
+                <w:sz w:val="22"/>
+                <w:szCs w:val="22"/>
+              </w:rPr>
+              <w:t>Cuenta a debitar</w:t>
+            </w:r>
+          </w:p>
+        </w:tc>
+        <w:tc>
+          <w:tcPr>
+            <w:tcW w:w="1257" w:type="dxa"/>
             <w:tcBorders>
               <w:top w:val="single" w:sz="4" w:space="0" w:color="000000"/>
               <w:start w:val="single" w:sz="4" w:space="0" w:color="000000"/>
@@ -304,10 +426,40 @@
               <w:pStyle w:val="TableContents"/>
               <w:bidi w:val="0"/>
               <w:jc w:val="start"/>
+              <w:rPr>
+                <w:sz w:val="22"/>
+                <w:szCs w:val="22"/>
+              </w:rPr>
+            </w:pPr>
+            <w:r>
               <w:rPr>
                 <w:rFonts w:ascii="Times New Roman" w:hAnsi="Times New Roman"/>
                 <w:b/>
                 <w:bCs/>
+                <w:sz w:val="22"/>
+                <w:szCs w:val="22"/>
+              </w:rPr>
+              <w:t>Nro. de Cuenta</w:t>
+            </w:r>
+          </w:p>
+        </w:tc>
+        <w:tc>
+          <w:tcPr>
+            <w:tcW w:w="855" w:type="dxa"/>
+            <w:tcBorders>
+              <w:top w:val="single" w:sz="4" w:space="0" w:color="000000"/>
+              <w:start w:val="single" w:sz="4" w:space="0" w:color="000000"/>
+              <w:bottom w:val="single" w:sz="4" w:space="0" w:color="000000"/>
+            </w:tcBorders>
+          </w:tcPr>
+          <w:p>
+            <w:pPr>
+              <w:pStyle w:val="TableContents"/>
+              <w:bidi w:val="0"/>
+              <w:jc w:val="start"/>
+              <w:rPr>
+                <w:sz w:val="22"/>
+                <w:szCs w:val="22"/>
               </w:rPr>
             </w:pPr>
             <w:r>
@@ -315,14 +467,16 @@
                 <w:rFonts w:ascii="Times New Roman" w:hAnsi="Times New Roman"/>
                 <w:b/>
                 <w:bCs/>
-              </w:rPr>
-              <w:t>Importe</w:t>
-            </w:r>
-          </w:p>
-        </w:tc>
-        <w:tc>
-          <w:tcPr>
-            <w:tcW w:w="1345" w:type="dxa"/>
+                <w:sz w:val="22"/>
+                <w:szCs w:val="22"/>
+              </w:rPr>
+              <w:t>Zona</w:t>
+            </w:r>
+          </w:p>
+        </w:tc>
+        <w:tc>
+          <w:tcPr>
+            <w:tcW w:w="838" w:type="dxa"/>
             <w:tcBorders>
               <w:top w:val="single" w:sz="4" w:space="0" w:color="000000"/>
               <w:start w:val="single" w:sz="4" w:space="0" w:color="000000"/>
@@ -334,10 +488,40 @@
               <w:pStyle w:val="TableContents"/>
               <w:bidi w:val="0"/>
               <w:jc w:val="start"/>
+              <w:rPr>
+                <w:sz w:val="22"/>
+                <w:szCs w:val="22"/>
+              </w:rPr>
+            </w:pPr>
+            <w:r>
               <w:rPr>
                 <w:rFonts w:ascii="Times New Roman" w:hAnsi="Times New Roman"/>
                 <w:b/>
                 <w:bCs/>
+                <w:sz w:val="22"/>
+                <w:szCs w:val="22"/>
+              </w:rPr>
+              <w:t>Centro</w:t>
+            </w:r>
+          </w:p>
+        </w:tc>
+        <w:tc>
+          <w:tcPr>
+            <w:tcW w:w="830" w:type="dxa"/>
+            <w:tcBorders>
+              <w:top w:val="single" w:sz="4" w:space="0" w:color="000000"/>
+              <w:start w:val="single" w:sz="4" w:space="0" w:color="000000"/>
+              <w:bottom w:val="single" w:sz="4" w:space="0" w:color="000000"/>
+            </w:tcBorders>
+          </w:tcPr>
+          <w:p>
+            <w:pPr>
+              <w:pStyle w:val="TableContents"/>
+              <w:bidi w:val="0"/>
+              <w:jc w:val="start"/>
+              <w:rPr>
+                <w:sz w:val="22"/>
+                <w:szCs w:val="22"/>
               </w:rPr>
             </w:pPr>
             <w:r>
@@ -345,14 +529,16 @@
                 <w:rFonts w:ascii="Times New Roman" w:hAnsi="Times New Roman"/>
                 <w:b/>
                 <w:bCs/>
-              </w:rPr>
-              <w:t>Cuenta a debitar</w:t>
-            </w:r>
-          </w:p>
-        </w:tc>
-        <w:tc>
-          <w:tcPr>
-            <w:tcW w:w="1257" w:type="dxa"/>
+                <w:sz w:val="22"/>
+                <w:szCs w:val="22"/>
+              </w:rPr>
+              <w:t>Sector</w:t>
+            </w:r>
+          </w:p>
+        </w:tc>
+        <w:tc>
+          <w:tcPr>
+            <w:tcW w:w="1716" w:type="dxa"/>
             <w:tcBorders>
               <w:top w:val="single" w:sz="4" w:space="0" w:color="000000"/>
               <w:start w:val="single" w:sz="4" w:space="0" w:color="000000"/>
@@ -364,10 +550,41 @@
               <w:pStyle w:val="TableContents"/>
               <w:bidi w:val="0"/>
               <w:jc w:val="start"/>
+              <w:rPr>
+                <w:sz w:val="22"/>
+                <w:szCs w:val="22"/>
+              </w:rPr>
+            </w:pPr>
+            <w:r>
               <w:rPr>
                 <w:rFonts w:ascii="Times New Roman" w:hAnsi="Times New Roman"/>
                 <w:b/>
                 <w:bCs/>
+                <w:sz w:val="22"/>
+                <w:szCs w:val="22"/>
+              </w:rPr>
+              <w:t>CUIL</w:t>
+            </w:r>
+          </w:p>
+        </w:tc>
+        <w:tc>
+          <w:tcPr>
+            <w:tcW w:w="2448" w:type="dxa"/>
+            <w:tcBorders>
+              <w:top w:val="single" w:sz="4" w:space="0" w:color="000000"/>
+              <w:start w:val="single" w:sz="4" w:space="0" w:color="000000"/>
+              <w:bottom w:val="single" w:sz="4" w:space="0" w:color="000000"/>
+              <w:end w:val="single" w:sz="4" w:space="0" w:color="000000"/>
+            </w:tcBorders>
+          </w:tcPr>
+          <w:p>
+            <w:pPr>
+              <w:pStyle w:val="TableContents"/>
+              <w:bidi w:val="0"/>
+              <w:jc w:val="start"/>
+              <w:rPr>
+                <w:sz w:val="22"/>
+                <w:szCs w:val="22"/>
               </w:rPr>
             </w:pPr>
             <w:r>
@@ -375,157 +592,8 @@
                 <w:rFonts w:ascii="Times New Roman" w:hAnsi="Times New Roman"/>
                 <w:b/>
                 <w:bCs/>
-              </w:rPr>
-              <w:t>Nro. de Cuenta</w:t>
-            </w:r>
-          </w:p>
-        </w:tc>
-        <w:tc>
-          <w:tcPr>
-            <w:tcW w:w="855" w:type="dxa"/>
-            <w:tcBorders>
-              <w:top w:val="single" w:sz="4" w:space="0" w:color="000000"/>
-              <w:start w:val="single" w:sz="4" w:space="0" w:color="000000"/>
-              <w:bottom w:val="single" w:sz="4" w:space="0" w:color="000000"/>
-            </w:tcBorders>
-          </w:tcPr>
-          <w:p>
-            <w:pPr>
-              <w:pStyle w:val="TableContents"/>
-              <w:bidi w:val="0"/>
-              <w:jc w:val="start"/>
-              <w:rPr>
-                <w:rFonts w:ascii="Times New Roman" w:hAnsi="Times New Roman"/>
-                <w:b/>
-                <w:bCs/>
-              </w:rPr>
-            </w:pPr>
-            <w:r>
-              <w:rPr>
-                <w:rFonts w:ascii="Times New Roman" w:hAnsi="Times New Roman"/>
-                <w:b/>
-                <w:bCs/>
-              </w:rPr>
-              <w:t>Zona</w:t>
-            </w:r>
-          </w:p>
-        </w:tc>
-        <w:tc>
-          <w:tcPr>
-            <w:tcW w:w="838" w:type="dxa"/>
-            <w:tcBorders>
-              <w:top w:val="single" w:sz="4" w:space="0" w:color="000000"/>
-              <w:start w:val="single" w:sz="4" w:space="0" w:color="000000"/>
-              <w:bottom w:val="single" w:sz="4" w:space="0" w:color="000000"/>
-            </w:tcBorders>
-          </w:tcPr>
-          <w:p>
-            <w:pPr>
-              <w:pStyle w:val="TableContents"/>
-              <w:bidi w:val="0"/>
-              <w:jc w:val="start"/>
-              <w:rPr>
-                <w:rFonts w:ascii="Times New Roman" w:hAnsi="Times New Roman"/>
-                <w:b/>
-                <w:bCs/>
-              </w:rPr>
-            </w:pPr>
-            <w:r>
-              <w:rPr>
-                <w:rFonts w:ascii="Times New Roman" w:hAnsi="Times New Roman"/>
-                <w:b/>
-                <w:bCs/>
-              </w:rPr>
-              <w:t>Centro</w:t>
-            </w:r>
-          </w:p>
-        </w:tc>
-        <w:tc>
-          <w:tcPr>
-            <w:tcW w:w="830" w:type="dxa"/>
-            <w:tcBorders>
-              <w:top w:val="single" w:sz="4" w:space="0" w:color="000000"/>
-              <w:start w:val="single" w:sz="4" w:space="0" w:color="000000"/>
-              <w:bottom w:val="single" w:sz="4" w:space="0" w:color="000000"/>
-            </w:tcBorders>
-          </w:tcPr>
-          <w:p>
-            <w:pPr>
-              <w:pStyle w:val="TableContents"/>
-              <w:bidi w:val="0"/>
-              <w:jc w:val="start"/>
-              <w:rPr>
-                <w:rFonts w:ascii="Times New Roman" w:hAnsi="Times New Roman"/>
-                <w:b/>
-                <w:bCs/>
-              </w:rPr>
-            </w:pPr>
-            <w:r>
-              <w:rPr>
-                <w:rFonts w:ascii="Times New Roman" w:hAnsi="Times New Roman"/>
-                <w:b/>
-                <w:bCs/>
-              </w:rPr>
-              <w:t>Sector</w:t>
-            </w:r>
-          </w:p>
-        </w:tc>
-        <w:tc>
-          <w:tcPr>
-            <w:tcW w:w="1716" w:type="dxa"/>
-            <w:tcBorders>
-              <w:top w:val="single" w:sz="4" w:space="0" w:color="000000"/>
-              <w:start w:val="single" w:sz="4" w:space="0" w:color="000000"/>
-              <w:bottom w:val="single" w:sz="4" w:space="0" w:color="000000"/>
-            </w:tcBorders>
-          </w:tcPr>
-          <w:p>
-            <w:pPr>
-              <w:pStyle w:val="TableContents"/>
-              <w:bidi w:val="0"/>
-              <w:jc w:val="start"/>
-              <w:rPr>
-                <w:rFonts w:ascii="Times New Roman" w:hAnsi="Times New Roman"/>
-                <w:b/>
-                <w:bCs/>
-              </w:rPr>
-            </w:pPr>
-            <w:r>
-              <w:rPr>
-                <w:rFonts w:ascii="Times New Roman" w:hAnsi="Times New Roman"/>
-                <w:b/>
-                <w:bCs/>
-              </w:rPr>
-              <w:t>CUIL</w:t>
-            </w:r>
-          </w:p>
-        </w:tc>
-        <w:tc>
-          <w:tcPr>
-            <w:tcW w:w="2448" w:type="dxa"/>
-            <w:tcBorders>
-              <w:top w:val="single" w:sz="4" w:space="0" w:color="000000"/>
-              <w:start w:val="single" w:sz="4" w:space="0" w:color="000000"/>
-              <w:bottom w:val="single" w:sz="4" w:space="0" w:color="000000"/>
-              <w:end w:val="single" w:sz="4" w:space="0" w:color="000000"/>
-            </w:tcBorders>
-          </w:tcPr>
-          <w:p>
-            <w:pPr>
-              <w:pStyle w:val="TableContents"/>
-              <w:bidi w:val="0"/>
-              <w:jc w:val="start"/>
-              <w:rPr>
-                <w:rFonts w:ascii="Times New Roman" w:hAnsi="Times New Roman"/>
-                <w:b/>
-                <w:bCs/>
-              </w:rPr>
-            </w:pPr>
-            <w:r>
-              <w:rPr>
-                <w:rFonts w:ascii="Times New Roman" w:hAnsi="Times New Roman"/>
-                <w:b/>
-                <w:bCs/>
+                <w:sz w:val="22"/>
+                <w:szCs w:val="22"/>
               </w:rPr>
               <w:t>Motivo de baja</w:t>
             </w:r>
@@ -550,14 +618,15 @@
               <w:bidi w:val="0"/>
               <w:jc w:val="start"/>
               <w:rPr>
-                <w:rFonts w:ascii="Times New Roman" w:hAnsi="Times New Roman"/>
-              </w:rPr>
-            </w:pPr>
-            <w:r>
-              <w:rPr>
-                <w:rFonts w:ascii="Times New Roman" w:hAnsi="Times New Roman"/>
-                <w:sz w:val="24"/>
-                <w:szCs w:val="24"/>
+                <w:sz w:val="22"/>
+                <w:szCs w:val="22"/>
+              </w:rPr>
+            </w:pPr>
+            <w:r>
+              <w:rPr>
+                <w:rFonts w:ascii="Times New Roman" w:hAnsi="Times New Roman"/>
+                <w:sz w:val="22"/>
+                <w:szCs w:val="22"/>
               </w:rPr>
               <w:t>{%tr for item in lista %}</w:t>
             </w:r>
@@ -578,15 +647,15 @@
               <w:jc w:val="start"/>
               <w:rPr>
                 <w:rFonts w:ascii="Times New Roman" w:hAnsi="Times New Roman"/>
-                <w:sz w:val="24"/>
-                <w:szCs w:val="24"/>
-              </w:rPr>
-            </w:pPr>
-            <w:r>
-              <w:rPr>
-                <w:rFonts w:ascii="Times New Roman" w:hAnsi="Times New Roman"/>
-                <w:sz w:val="24"/>
-                <w:szCs w:val="24"/>
+                <w:sz w:val="22"/>
+                <w:szCs w:val="22"/>
+              </w:rPr>
+            </w:pPr>
+            <w:r>
+              <w:rPr>
+                <w:rFonts w:ascii="Times New Roman" w:hAnsi="Times New Roman"/>
+                <w:sz w:val="22"/>
+                <w:szCs w:val="22"/>
               </w:rPr>
             </w:r>
           </w:p>
@@ -606,11 +675,15 @@
               <w:jc w:val="start"/>
               <w:rPr>
                 <w:rFonts w:ascii="Times New Roman" w:hAnsi="Times New Roman"/>
-              </w:rPr>
-            </w:pPr>
-            <w:r>
-              <w:rPr>
-                <w:rFonts w:ascii="Times New Roman" w:hAnsi="Times New Roman"/>
+                <w:sz w:val="22"/>
+                <w:szCs w:val="22"/>
+              </w:rPr>
+            </w:pPr>
+            <w:r>
+              <w:rPr>
+                <w:rFonts w:ascii="Times New Roman" w:hAnsi="Times New Roman"/>
+                <w:sz w:val="22"/>
+                <w:szCs w:val="22"/>
               </w:rPr>
             </w:r>
           </w:p>
@@ -630,11 +703,15 @@
               <w:jc w:val="start"/>
               <w:rPr>
                 <w:rFonts w:ascii="Times New Roman" w:hAnsi="Times New Roman"/>
-              </w:rPr>
-            </w:pPr>
-            <w:r>
-              <w:rPr>
-                <w:rFonts w:ascii="Times New Roman" w:hAnsi="Times New Roman"/>
+                <w:sz w:val="22"/>
+                <w:szCs w:val="22"/>
+              </w:rPr>
+            </w:pPr>
+            <w:r>
+              <w:rPr>
+                <w:rFonts w:ascii="Times New Roman" w:hAnsi="Times New Roman"/>
+                <w:sz w:val="22"/>
+                <w:szCs w:val="22"/>
               </w:rPr>
             </w:r>
           </w:p>
@@ -654,11 +731,15 @@
               <w:jc w:val="start"/>
               <w:rPr>
                 <w:rFonts w:ascii="Times New Roman" w:hAnsi="Times New Roman"/>
-              </w:rPr>
-            </w:pPr>
-            <w:r>
-              <w:rPr>
-                <w:rFonts w:ascii="Times New Roman" w:hAnsi="Times New Roman"/>
+                <w:sz w:val="22"/>
+                <w:szCs w:val="22"/>
+              </w:rPr>
+            </w:pPr>
+            <w:r>
+              <w:rPr>
+                <w:rFonts w:ascii="Times New Roman" w:hAnsi="Times New Roman"/>
+                <w:sz w:val="22"/>
+                <w:szCs w:val="22"/>
               </w:rPr>
             </w:r>
           </w:p>
@@ -678,11 +759,15 @@
               <w:jc w:val="start"/>
               <w:rPr>
                 <w:rFonts w:ascii="Times New Roman" w:hAnsi="Times New Roman"/>
-              </w:rPr>
-            </w:pPr>
-            <w:r>
-              <w:rPr>
-                <w:rFonts w:ascii="Times New Roman" w:hAnsi="Times New Roman"/>
+                <w:sz w:val="22"/>
+                <w:szCs w:val="22"/>
+              </w:rPr>
+            </w:pPr>
+            <w:r>
+              <w:rPr>
+                <w:rFonts w:ascii="Times New Roman" w:hAnsi="Times New Roman"/>
+                <w:sz w:val="22"/>
+                <w:szCs w:val="22"/>
               </w:rPr>
             </w:r>
           </w:p>
@@ -702,11 +787,15 @@
               <w:jc w:val="start"/>
               <w:rPr>
                 <w:rFonts w:ascii="Times New Roman" w:hAnsi="Times New Roman"/>
-              </w:rPr>
-            </w:pPr>
-            <w:r>
-              <w:rPr>
-                <w:rFonts w:ascii="Times New Roman" w:hAnsi="Times New Roman"/>
+                <w:sz w:val="22"/>
+                <w:szCs w:val="22"/>
+              </w:rPr>
+            </w:pPr>
+            <w:r>
+              <w:rPr>
+                <w:rFonts w:ascii="Times New Roman" w:hAnsi="Times New Roman"/>
+                <w:sz w:val="22"/>
+                <w:szCs w:val="22"/>
               </w:rPr>
             </w:r>
           </w:p>
@@ -726,11 +815,15 @@
               <w:jc w:val="start"/>
               <w:rPr>
                 <w:rFonts w:ascii="Times New Roman" w:hAnsi="Times New Roman"/>
-              </w:rPr>
-            </w:pPr>
-            <w:r>
-              <w:rPr>
-                <w:rFonts w:ascii="Times New Roman" w:hAnsi="Times New Roman"/>
+                <w:sz w:val="22"/>
+                <w:szCs w:val="22"/>
+              </w:rPr>
+            </w:pPr>
+            <w:r>
+              <w:rPr>
+                <w:rFonts w:ascii="Times New Roman" w:hAnsi="Times New Roman"/>
+                <w:sz w:val="22"/>
+                <w:szCs w:val="22"/>
               </w:rPr>
             </w:r>
           </w:p>
@@ -750,11 +843,15 @@
               <w:jc w:val="start"/>
               <w:rPr>
                 <w:rFonts w:ascii="Times New Roman" w:hAnsi="Times New Roman"/>
-              </w:rPr>
-            </w:pPr>
-            <w:r>
-              <w:rPr>
-                <w:rFonts w:ascii="Times New Roman" w:hAnsi="Times New Roman"/>
+                <w:sz w:val="22"/>
+                <w:szCs w:val="22"/>
+              </w:rPr>
+            </w:pPr>
+            <w:r>
+              <w:rPr>
+                <w:rFonts w:ascii="Times New Roman" w:hAnsi="Times New Roman"/>
+                <w:sz w:val="22"/>
+                <w:szCs w:val="22"/>
               </w:rPr>
             </w:r>
           </w:p>
@@ -775,11 +872,15 @@
               <w:jc w:val="start"/>
               <w:rPr>
                 <w:rFonts w:ascii="Times New Roman" w:hAnsi="Times New Roman"/>
-              </w:rPr>
-            </w:pPr>
-            <w:r>
-              <w:rPr>
-                <w:rFonts w:ascii="Times New Roman" w:hAnsi="Times New Roman"/>
+                <w:sz w:val="22"/>
+                <w:szCs w:val="22"/>
+              </w:rPr>
+            </w:pPr>
+            <w:r>
+              <w:rPr>
+                <w:rFonts w:ascii="Times New Roman" w:hAnsi="Times New Roman"/>
+                <w:sz w:val="22"/>
+                <w:szCs w:val="22"/>
               </w:rPr>
             </w:r>
           </w:p>
@@ -803,12 +904,15 @@
               <w:bidi w:val="0"/>
               <w:jc w:val="start"/>
               <w:rPr>
-                <w:rFonts w:ascii="Times New Roman" w:hAnsi="Times New Roman"/>
-              </w:rPr>
-            </w:pPr>
-            <w:r>
-              <w:rPr>
-                <w:rFonts w:ascii="Times New Roman" w:hAnsi="Times New Roman"/>
+                <w:sz w:val="22"/>
+                <w:szCs w:val="22"/>
+              </w:rPr>
+            </w:pPr>
+            <w:r>
+              <w:rPr>
+                <w:rFonts w:ascii="Times New Roman" w:hAnsi="Times New Roman"/>
+                <w:sz w:val="22"/>
+                <w:szCs w:val="22"/>
                 <w:lang w:val="es-AR"/>
               </w:rPr>
               <w:t>{{item.padron}}</w:t>
@@ -829,12 +933,15 @@
               <w:bidi w:val="0"/>
               <w:jc w:val="start"/>
               <w:rPr>
-                <w:rFonts w:ascii="Times New Roman" w:hAnsi="Times New Roman"/>
-              </w:rPr>
-            </w:pPr>
-            <w:r>
-              <w:rPr>
-                <w:rFonts w:ascii="Times New Roman" w:hAnsi="Times New Roman"/>
+                <w:sz w:val="22"/>
+                <w:szCs w:val="22"/>
+              </w:rPr>
+            </w:pPr>
+            <w:r>
+              <w:rPr>
+                <w:rFonts w:ascii="Times New Roman" w:hAnsi="Times New Roman"/>
+                <w:sz w:val="22"/>
+                <w:szCs w:val="22"/>
               </w:rPr>
               <w:t>{{item.beneficiario_nombre}}</w:t>
             </w:r>
@@ -854,12 +961,15 @@
               <w:bidi w:val="0"/>
               <w:jc w:val="start"/>
               <w:rPr>
-                <w:rFonts w:ascii="Times New Roman" w:hAnsi="Times New Roman"/>
-              </w:rPr>
-            </w:pPr>
-            <w:r>
-              <w:rPr>
-                <w:rFonts w:ascii="Times New Roman" w:hAnsi="Times New Roman"/>
+                <w:sz w:val="22"/>
+                <w:szCs w:val="22"/>
+              </w:rPr>
+            </w:pPr>
+            <w:r>
+              <w:rPr>
+                <w:rFonts w:ascii="Times New Roman" w:hAnsi="Times New Roman"/>
+                <w:sz w:val="22"/>
+                <w:szCs w:val="22"/>
               </w:rPr>
               <w:t>{{item.importe}}</w:t>
             </w:r>
@@ -879,12 +989,15 @@
               <w:bidi w:val="0"/>
               <w:jc w:val="start"/>
               <w:rPr>
-                <w:rFonts w:ascii="Times New Roman" w:hAnsi="Times New Roman"/>
-              </w:rPr>
-            </w:pPr>
-            <w:r>
-              <w:rPr>
-                <w:rFonts w:ascii="Times New Roman" w:hAnsi="Times New Roman"/>
+                <w:sz w:val="22"/>
+                <w:szCs w:val="22"/>
+              </w:rPr>
+            </w:pPr>
+            <w:r>
+              <w:rPr>
+                <w:rFonts w:ascii="Times New Roman" w:hAnsi="Times New Roman"/>
+                <w:sz w:val="22"/>
+                <w:szCs w:val="22"/>
               </w:rPr>
               <w:t>{{item.cuenta_debito}}</w:t>
             </w:r>
@@ -904,12 +1017,15 @@
               <w:bidi w:val="0"/>
               <w:jc w:val="start"/>
               <w:rPr>
-                <w:rFonts w:ascii="Times New Roman" w:hAnsi="Times New Roman"/>
-              </w:rPr>
-            </w:pPr>
-            <w:r>
-              <w:rPr>
-                <w:rFonts w:ascii="Times New Roman" w:hAnsi="Times New Roman"/>
+                <w:sz w:val="22"/>
+                <w:szCs w:val="22"/>
+              </w:rPr>
+            </w:pPr>
+            <w:r>
+              <w:rPr>
+                <w:rFonts w:ascii="Times New Roman" w:hAnsi="Times New Roman"/>
+                <w:sz w:val="22"/>
+                <w:szCs w:val="22"/>
               </w:rPr>
               <w:t>{{item.cuenta_acreditacion}}</w:t>
             </w:r>
@@ -929,12 +1045,15 @@
               <w:bidi w:val="0"/>
               <w:jc w:val="start"/>
               <w:rPr>
-                <w:rFonts w:ascii="Times New Roman" w:hAnsi="Times New Roman"/>
-              </w:rPr>
-            </w:pPr>
-            <w:r>
-              <w:rPr>
-                <w:rFonts w:ascii="Times New Roman" w:hAnsi="Times New Roman"/>
+                <w:sz w:val="22"/>
+                <w:szCs w:val="22"/>
+              </w:rPr>
+            </w:pPr>
+            <w:r>
+              <w:rPr>
+                <w:rFonts w:ascii="Times New Roman" w:hAnsi="Times New Roman"/>
+                <w:sz w:val="22"/>
+                <w:szCs w:val="22"/>
               </w:rPr>
               <w:t>{{item.zona}}</w:t>
             </w:r>
@@ -954,12 +1073,15 @@
               <w:bidi w:val="0"/>
               <w:jc w:val="start"/>
               <w:rPr>
-                <w:rFonts w:ascii="Times New Roman" w:hAnsi="Times New Roman"/>
-              </w:rPr>
-            </w:pPr>
-            <w:r>
-              <w:rPr>
-                <w:rFonts w:ascii="Times New Roman" w:hAnsi="Times New Roman"/>
+                <w:sz w:val="22"/>
+                <w:szCs w:val="22"/>
+              </w:rPr>
+            </w:pPr>
+            <w:r>
+              <w:rPr>
+                <w:rFonts w:ascii="Times New Roman" w:hAnsi="Times New Roman"/>
+                <w:sz w:val="22"/>
+                <w:szCs w:val="22"/>
               </w:rPr>
               <w:t>{{item.centro}}</w:t>
             </w:r>
@@ -979,12 +1101,15 @@
               <w:bidi w:val="0"/>
               <w:jc w:val="start"/>
               <w:rPr>
-                <w:rFonts w:ascii="Times New Roman" w:hAnsi="Times New Roman"/>
-              </w:rPr>
-            </w:pPr>
-            <w:r>
-              <w:rPr>
-                <w:rFonts w:ascii="Times New Roman" w:hAnsi="Times New Roman"/>
+                <w:sz w:val="22"/>
+                <w:szCs w:val="22"/>
+              </w:rPr>
+            </w:pPr>
+            <w:r>
+              <w:rPr>
+                <w:rFonts w:ascii="Times New Roman" w:hAnsi="Times New Roman"/>
+                <w:sz w:val="22"/>
+                <w:szCs w:val="22"/>
               </w:rPr>
               <w:t>{{item.sector}}</w:t>
             </w:r>
@@ -1004,12 +1129,15 @@
               <w:bidi w:val="0"/>
               <w:jc w:val="start"/>
               <w:rPr>
-                <w:rFonts w:ascii="Times New Roman" w:hAnsi="Times New Roman"/>
-              </w:rPr>
-            </w:pPr>
-            <w:r>
-              <w:rPr>
-                <w:rFonts w:ascii="Times New Roman" w:hAnsi="Times New Roman"/>
+                <w:sz w:val="22"/>
+                <w:szCs w:val="22"/>
+              </w:rPr>
+            </w:pPr>
+            <w:r>
+              <w:rPr>
+                <w:rFonts w:ascii="Times New Roman" w:hAnsi="Times New Roman"/>
+                <w:sz w:val="22"/>
+                <w:szCs w:val="22"/>
               </w:rPr>
               <w:t>{{item.cuil}}</w:t>
             </w:r>
@@ -1031,12 +1159,15 @@
               <w:spacing w:lineRule="auto" w:line="240" w:before="0" w:after="0"/>
               <w:jc w:val="start"/>
               <w:rPr>
-                <w:rFonts w:ascii="Times New Roman" w:hAnsi="Times New Roman"/>
-              </w:rPr>
-            </w:pPr>
-            <w:r>
-              <w:rPr>
-                <w:rFonts w:ascii="Times New Roman" w:hAnsi="Times New Roman"/>
+                <w:sz w:val="22"/>
+                <w:szCs w:val="22"/>
+              </w:rPr>
+            </w:pPr>
+            <w:r>
+              <w:rPr>
+                <w:rFonts w:ascii="Times New Roman" w:hAnsi="Times New Roman"/>
+                <w:sz w:val="22"/>
+                <w:szCs w:val="22"/>
                 <w:lang w:val="es-AR"/>
               </w:rPr>
               <w:t>{{item.motivo}}</w:t>
@@ -1062,12 +1193,15 @@
               <w:bidi w:val="0"/>
               <w:jc w:val="start"/>
               <w:rPr>
-                <w:rFonts w:ascii="Times New Roman" w:hAnsi="Times New Roman"/>
-              </w:rPr>
-            </w:pPr>
-            <w:r>
-              <w:rPr>
-                <w:rFonts w:ascii="Times New Roman" w:hAnsi="Times New Roman"/>
+                <w:sz w:val="22"/>
+                <w:szCs w:val="22"/>
+              </w:rPr>
+            </w:pPr>
+            <w:r>
+              <w:rPr>
+                <w:rFonts w:ascii="Times New Roman" w:hAnsi="Times New Roman"/>
+                <w:sz w:val="22"/>
+                <w:szCs w:val="22"/>
                 <w:lang w:val="es-AR"/>
               </w:rPr>
               <w:t>{%tr endfor %}</w:t>
@@ -1089,11 +1223,15 @@
               <w:jc w:val="start"/>
               <w:rPr>
                 <w:rFonts w:ascii="Times New Roman" w:hAnsi="Times New Roman"/>
-              </w:rPr>
-            </w:pPr>
-            <w:r>
-              <w:rPr>
-                <w:rFonts w:ascii="Times New Roman" w:hAnsi="Times New Roman"/>
+                <w:sz w:val="22"/>
+                <w:szCs w:val="22"/>
+              </w:rPr>
+            </w:pPr>
+            <w:r>
+              <w:rPr>
+                <w:rFonts w:ascii="Times New Roman" w:hAnsi="Times New Roman"/>
+                <w:sz w:val="22"/>
+                <w:szCs w:val="22"/>
               </w:rPr>
             </w:r>
           </w:p>
@@ -1113,11 +1251,15 @@
               <w:jc w:val="start"/>
               <w:rPr>
                 <w:rFonts w:ascii="Times New Roman" w:hAnsi="Times New Roman"/>
-              </w:rPr>
-            </w:pPr>
-            <w:r>
-              <w:rPr>
-                <w:rFonts w:ascii="Times New Roman" w:hAnsi="Times New Roman"/>
+                <w:sz w:val="22"/>
+                <w:szCs w:val="22"/>
+              </w:rPr>
+            </w:pPr>
+            <w:r>
+              <w:rPr>
+                <w:rFonts w:ascii="Times New Roman" w:hAnsi="Times New Roman"/>
+                <w:sz w:val="22"/>
+                <w:szCs w:val="22"/>
               </w:rPr>
             </w:r>
           </w:p>
@@ -1137,11 +1279,15 @@
               <w:jc w:val="start"/>
               <w:rPr>
                 <w:rFonts w:ascii="Times New Roman" w:hAnsi="Times New Roman"/>
-              </w:rPr>
-            </w:pPr>
-            <w:r>
-              <w:rPr>
-                <w:rFonts w:ascii="Times New Roman" w:hAnsi="Times New Roman"/>
+                <w:sz w:val="22"/>
+                <w:szCs w:val="22"/>
+              </w:rPr>
+            </w:pPr>
+            <w:r>
+              <w:rPr>
+                <w:rFonts w:ascii="Times New Roman" w:hAnsi="Times New Roman"/>
+                <w:sz w:val="22"/>
+                <w:szCs w:val="22"/>
               </w:rPr>
             </w:r>
           </w:p>
@@ -1161,11 +1307,15 @@
               <w:jc w:val="start"/>
               <w:rPr>
                 <w:rFonts w:ascii="Times New Roman" w:hAnsi="Times New Roman"/>
-              </w:rPr>
-            </w:pPr>
-            <w:r>
-              <w:rPr>
-                <w:rFonts w:ascii="Times New Roman" w:hAnsi="Times New Roman"/>
+                <w:sz w:val="22"/>
+                <w:szCs w:val="22"/>
+              </w:rPr>
+            </w:pPr>
+            <w:r>
+              <w:rPr>
+                <w:rFonts w:ascii="Times New Roman" w:hAnsi="Times New Roman"/>
+                <w:sz w:val="22"/>
+                <w:szCs w:val="22"/>
               </w:rPr>
             </w:r>
           </w:p>
@@ -1185,11 +1335,15 @@
               <w:jc w:val="start"/>
               <w:rPr>
                 <w:rFonts w:ascii="Times New Roman" w:hAnsi="Times New Roman"/>
-              </w:rPr>
-            </w:pPr>
-            <w:r>
-              <w:rPr>
-                <w:rFonts w:ascii="Times New Roman" w:hAnsi="Times New Roman"/>
+                <w:sz w:val="22"/>
+                <w:szCs w:val="22"/>
+              </w:rPr>
+            </w:pPr>
+            <w:r>
+              <w:rPr>
+                <w:rFonts w:ascii="Times New Roman" w:hAnsi="Times New Roman"/>
+                <w:sz w:val="22"/>
+                <w:szCs w:val="22"/>
               </w:rPr>
             </w:r>
           </w:p>
@@ -1209,11 +1363,15 @@
               <w:jc w:val="start"/>
               <w:rPr>
                 <w:rFonts w:ascii="Times New Roman" w:hAnsi="Times New Roman"/>
-              </w:rPr>
-            </w:pPr>
-            <w:r>
-              <w:rPr>
-                <w:rFonts w:ascii="Times New Roman" w:hAnsi="Times New Roman"/>
+                <w:sz w:val="22"/>
+                <w:szCs w:val="22"/>
+              </w:rPr>
+            </w:pPr>
+            <w:r>
+              <w:rPr>
+                <w:rFonts w:ascii="Times New Roman" w:hAnsi="Times New Roman"/>
+                <w:sz w:val="22"/>
+                <w:szCs w:val="22"/>
               </w:rPr>
             </w:r>
           </w:p>
@@ -1233,11 +1391,15 @@
               <w:jc w:val="start"/>
               <w:rPr>
                 <w:rFonts w:ascii="Times New Roman" w:hAnsi="Times New Roman"/>
-              </w:rPr>
-            </w:pPr>
-            <w:r>
-              <w:rPr>
-                <w:rFonts w:ascii="Times New Roman" w:hAnsi="Times New Roman"/>
+                <w:sz w:val="22"/>
+                <w:szCs w:val="22"/>
+              </w:rPr>
+            </w:pPr>
+            <w:r>
+              <w:rPr>
+                <w:rFonts w:ascii="Times New Roman" w:hAnsi="Times New Roman"/>
+                <w:sz w:val="22"/>
+                <w:szCs w:val="22"/>
               </w:rPr>
             </w:r>
           </w:p>
@@ -1257,11 +1419,15 @@
               <w:jc w:val="start"/>
               <w:rPr>
                 <w:rFonts w:ascii="Times New Roman" w:hAnsi="Times New Roman"/>
-              </w:rPr>
-            </w:pPr>
-            <w:r>
-              <w:rPr>
-                <w:rFonts w:ascii="Times New Roman" w:hAnsi="Times New Roman"/>
+                <w:sz w:val="22"/>
+                <w:szCs w:val="22"/>
+              </w:rPr>
+            </w:pPr>
+            <w:r>
+              <w:rPr>
+                <w:rFonts w:ascii="Times New Roman" w:hAnsi="Times New Roman"/>
+                <w:sz w:val="22"/>
+                <w:szCs w:val="22"/>
               </w:rPr>
             </w:r>
           </w:p>
@@ -1283,12 +1449,16 @@
               <w:jc w:val="start"/>
               <w:rPr>
                 <w:rFonts w:ascii="Times New Roman" w:hAnsi="Times New Roman"/>
+                <w:sz w:val="22"/>
+                <w:szCs w:val="22"/>
                 <w:lang w:val="es-AR"/>
               </w:rPr>
             </w:pPr>
             <w:r>
               <w:rPr>
                 <w:rFonts w:ascii="Times New Roman" w:hAnsi="Times New Roman"/>
+                <w:sz w:val="22"/>
+                <w:szCs w:val="22"/>
                 <w:lang w:val="es-AR"/>
               </w:rPr>
             </w:r>
@@ -1316,7 +1486,7 @@
     </w:p>
     <w:tbl>
       <w:tblPr>
-        <w:tblW w:w="8784" w:type="dxa"/>
+        <w:tblW w:w="4680" w:type="dxa"/>
         <w:jc w:val="start"/>
         <w:tblInd w:w="-5" w:type="dxa"/>
         <w:tblLayout w:type="fixed"/>
@@ -1328,14 +1498,14 @@
         </w:tblCellMar>
       </w:tblPr>
       <w:tblGrid>
-        <w:gridCol w:w="3251"/>
-        <w:gridCol w:w="5533"/>
+        <w:gridCol w:w="1170"/>
+        <w:gridCol w:w="3510"/>
       </w:tblGrid>
       <w:tr>
         <w:trPr/>
         <w:tc>
           <w:tcPr>
-            <w:tcW w:w="3251" w:type="dxa"/>
+            <w:tcW w:w="1170" w:type="dxa"/>
             <w:tcBorders>
               <w:top w:val="single" w:sz="4" w:space="0" w:color="000000"/>
               <w:start w:val="single" w:sz="4" w:space="0" w:color="000000"/>
@@ -1345,17 +1515,25 @@
           <w:p>
             <w:pPr>
               <w:pStyle w:val="TableContents"/>
-              <w:rPr/>
-            </w:pPr>
-            <w:r>
-              <w:rPr/>
+              <w:rPr>
+                <w:sz w:val="22"/>
+                <w:szCs w:val="22"/>
+              </w:rPr>
+            </w:pPr>
+            <w:r>
+              <w:rPr>
+                <w:b/>
+                <w:bCs/>
+                <w:sz w:val="22"/>
+                <w:szCs w:val="22"/>
+              </w:rPr>
               <w:t>TOTAL</w:t>
             </w:r>
           </w:p>
         </w:tc>
         <w:tc>
           <w:tcPr>
-            <w:tcW w:w="5533" w:type="dxa"/>
+            <w:tcW w:w="3510" w:type="dxa"/>
             <w:tcBorders>
               <w:top w:val="single" w:sz="4" w:space="0" w:color="000000"/>
               <w:start w:val="single" w:sz="4" w:space="0" w:color="000000"/>
@@ -1366,14 +1544,26 @@
           <w:p>
             <w:pPr>
               <w:pStyle w:val="TableContents"/>
-              <w:rPr/>
-            </w:pPr>
-            <w:r>
-              <w:rPr/>
+              <w:jc w:val="end"/>
+              <w:rPr>
+                <w:sz w:val="22"/>
+                <w:szCs w:val="22"/>
+              </w:rPr>
+            </w:pPr>
+            <w:r>
+              <w:rPr>
+                <w:sz w:val="22"/>
+                <w:szCs w:val="22"/>
+              </w:rPr>
               <w:t xml:space="preserve"> </w:t>
             </w:r>
             <w:r>
-              <w:rPr/>
+              <w:rPr>
+                <w:b/>
+                <w:bCs/>
+                <w:sz w:val="22"/>
+                <w:szCs w:val="22"/>
+              </w:rPr>
               <w:t>{{ importe_total }}</w:t>
             </w:r>
           </w:p>

</xml_diff>

<commit_message>
Agregada fecha a docx y excel, para los motivos que tienen lleva_fecha==True. Mejorado formato de template docx
</commit_message>
<xml_diff>
--- a/back/utils/templates/templateDocsV2.docx
+++ b/back/utils/templates/templateDocsV2.docx
@@ -134,8 +134,8 @@
               <w:spacing w:lineRule="auto" w:line="240" w:before="0" w:after="0"/>
               <w:jc w:val="start"/>
               <w:rPr>
-                <w:sz w:val="22"/>
-                <w:szCs w:val="22"/>
+                <w:sz w:val="20"/>
+                <w:szCs w:val="20"/>
               </w:rPr>
             </w:pPr>
             <w:r>
@@ -143,8 +143,8 @@
                 <w:rFonts w:ascii="Times New Roman" w:hAnsi="Times New Roman"/>
                 <w:b/>
                 <w:bCs/>
-                <w:sz w:val="22"/>
-                <w:szCs w:val="22"/>
+                <w:sz w:val="20"/>
+                <w:szCs w:val="20"/>
                 <w:lang w:val="es-AR"/>
               </w:rPr>
               <w:t>Concepto</w:t>
@@ -152,8 +152,8 @@
             <w:r>
               <w:rPr>
                 <w:rFonts w:ascii="Times New Roman" w:hAnsi="Times New Roman"/>
-                <w:sz w:val="22"/>
-                <w:szCs w:val="22"/>
+                <w:sz w:val="20"/>
+                <w:szCs w:val="20"/>
                 <w:lang w:val="es-AR"/>
               </w:rPr>
               <w:t xml:space="preserve"> {{ concepto }}</w:t>
@@ -175,24 +175,24 @@
               <w:spacing w:lineRule="auto" w:line="240" w:before="0" w:after="0"/>
               <w:jc w:val="start"/>
               <w:rPr>
-                <w:sz w:val="22"/>
-                <w:szCs w:val="22"/>
+                <w:sz w:val="20"/>
+                <w:szCs w:val="20"/>
               </w:rPr>
             </w:pPr>
             <w:r>
               <w:rPr>
                 <w:b/>
                 <w:bCs/>
-                <w:sz w:val="22"/>
-                <w:szCs w:val="22"/>
+                <w:sz w:val="20"/>
+                <w:szCs w:val="20"/>
                 <w:lang w:val="es-AR"/>
               </w:rPr>
               <w:t>Disco</w:t>
             </w:r>
             <w:r>
               <w:rPr>
-                <w:sz w:val="22"/>
-                <w:szCs w:val="22"/>
+                <w:sz w:val="20"/>
+                <w:szCs w:val="20"/>
                 <w:lang w:val="es-AR"/>
               </w:rPr>
               <w:t xml:space="preserve"> {{ concepto }}</w:t>
@@ -215,24 +215,24 @@
               <w:spacing w:lineRule="auto" w:line="240" w:before="0" w:after="0"/>
               <w:jc w:val="start"/>
               <w:rPr>
-                <w:sz w:val="22"/>
-                <w:szCs w:val="22"/>
+                <w:sz w:val="20"/>
+                <w:szCs w:val="20"/>
               </w:rPr>
             </w:pPr>
             <w:r>
               <w:rPr>
                 <w:b/>
                 <w:bCs/>
-                <w:sz w:val="22"/>
-                <w:szCs w:val="22"/>
+                <w:sz w:val="20"/>
+                <w:szCs w:val="20"/>
                 <w:lang w:val="es-AR"/>
               </w:rPr>
               <w:t>Fecha de Pago</w:t>
             </w:r>
             <w:r>
               <w:rPr>
-                <w:sz w:val="22"/>
-                <w:szCs w:val="22"/>
+                <w:sz w:val="20"/>
+                <w:szCs w:val="20"/>
                 <w:lang w:val="es-AR"/>
               </w:rPr>
               <w:t xml:space="preserve"> 30/06/2026</w:t>
@@ -278,11 +278,11 @@
         <w:gridCol w:w="1537"/>
         <w:gridCol w:w="1345"/>
         <w:gridCol w:w="1257"/>
-        <w:gridCol w:w="855"/>
-        <w:gridCol w:w="838"/>
-        <w:gridCol w:w="830"/>
-        <w:gridCol w:w="1716"/>
-        <w:gridCol w:w="2448"/>
+        <w:gridCol w:w="579"/>
+        <w:gridCol w:w="720"/>
+        <w:gridCol w:w="720"/>
+        <w:gridCol w:w="1440"/>
+        <w:gridCol w:w="3228"/>
       </w:tblGrid>
       <w:tr>
         <w:trPr>
@@ -303,8 +303,8 @@
               <w:bidi w:val="0"/>
               <w:jc w:val="start"/>
               <w:rPr>
-                <w:sz w:val="22"/>
-                <w:szCs w:val="22"/>
+                <w:sz w:val="20"/>
+                <w:szCs w:val="20"/>
               </w:rPr>
             </w:pPr>
             <w:r>
@@ -312,8 +312,8 @@
                 <w:rFonts w:ascii="Times New Roman" w:hAnsi="Times New Roman"/>
                 <w:b/>
                 <w:bCs/>
-                <w:sz w:val="22"/>
-                <w:szCs w:val="22"/>
+                <w:sz w:val="20"/>
+                <w:szCs w:val="20"/>
               </w:rPr>
               <w:t>Nro. de Padron</w:t>
             </w:r>
@@ -334,8 +334,8 @@
               <w:bidi w:val="0"/>
               <w:jc w:val="start"/>
               <w:rPr>
-                <w:sz w:val="22"/>
-                <w:szCs w:val="22"/>
+                <w:sz w:val="20"/>
+                <w:szCs w:val="20"/>
               </w:rPr>
             </w:pPr>
             <w:r>
@@ -343,8 +343,8 @@
                 <w:rFonts w:ascii="Times New Roman" w:hAnsi="Times New Roman"/>
                 <w:b/>
                 <w:bCs/>
-                <w:sz w:val="22"/>
-                <w:szCs w:val="22"/>
+                <w:sz w:val="20"/>
+                <w:szCs w:val="20"/>
               </w:rPr>
               <w:t>Apellido y nombre</w:t>
             </w:r>
@@ -365,8 +365,8 @@
               <w:bidi w:val="0"/>
               <w:jc w:val="start"/>
               <w:rPr>
-                <w:sz w:val="22"/>
-                <w:szCs w:val="22"/>
+                <w:sz w:val="20"/>
+                <w:szCs w:val="20"/>
               </w:rPr>
             </w:pPr>
             <w:r>
@@ -374,8 +374,8 @@
                 <w:rFonts w:ascii="Times New Roman" w:hAnsi="Times New Roman"/>
                 <w:b/>
                 <w:bCs/>
-                <w:sz w:val="22"/>
-                <w:szCs w:val="22"/>
+                <w:sz w:val="20"/>
+                <w:szCs w:val="20"/>
               </w:rPr>
               <w:t>Importe</w:t>
             </w:r>
@@ -396,8 +396,8 @@
               <w:bidi w:val="0"/>
               <w:jc w:val="start"/>
               <w:rPr>
-                <w:sz w:val="22"/>
-                <w:szCs w:val="22"/>
+                <w:sz w:val="20"/>
+                <w:szCs w:val="20"/>
               </w:rPr>
             </w:pPr>
             <w:r>
@@ -405,8 +405,8 @@
                 <w:rFonts w:ascii="Times New Roman" w:hAnsi="Times New Roman"/>
                 <w:b/>
                 <w:bCs/>
-                <w:sz w:val="22"/>
-                <w:szCs w:val="22"/>
+                <w:sz w:val="20"/>
+                <w:szCs w:val="20"/>
               </w:rPr>
               <w:t>Cuenta a debitar</w:t>
             </w:r>
@@ -427,8 +427,8 @@
               <w:bidi w:val="0"/>
               <w:jc w:val="start"/>
               <w:rPr>
-                <w:sz w:val="22"/>
-                <w:szCs w:val="22"/>
+                <w:sz w:val="20"/>
+                <w:szCs w:val="20"/>
               </w:rPr>
             </w:pPr>
             <w:r>
@@ -436,8 +436,8 @@
                 <w:rFonts w:ascii="Times New Roman" w:hAnsi="Times New Roman"/>
                 <w:b/>
                 <w:bCs/>
-                <w:sz w:val="22"/>
-                <w:szCs w:val="22"/>
+                <w:sz w:val="20"/>
+                <w:szCs w:val="20"/>
               </w:rPr>
               <w:t>Nro. de Cuenta</w:t>
             </w:r>
@@ -445,7 +445,7 @@
         </w:tc>
         <w:tc>
           <w:tcPr>
-            <w:tcW w:w="855" w:type="dxa"/>
+            <w:tcW w:w="579" w:type="dxa"/>
             <w:tcBorders>
               <w:top w:val="single" w:sz="4" w:space="0" w:color="000000"/>
               <w:start w:val="single" w:sz="4" w:space="0" w:color="000000"/>
@@ -458,8 +458,8 @@
               <w:bidi w:val="0"/>
               <w:jc w:val="start"/>
               <w:rPr>
-                <w:sz w:val="22"/>
-                <w:szCs w:val="22"/>
+                <w:sz w:val="20"/>
+                <w:szCs w:val="20"/>
               </w:rPr>
             </w:pPr>
             <w:r>
@@ -467,8 +467,8 @@
                 <w:rFonts w:ascii="Times New Roman" w:hAnsi="Times New Roman"/>
                 <w:b/>
                 <w:bCs/>
-                <w:sz w:val="22"/>
-                <w:szCs w:val="22"/>
+                <w:sz w:val="20"/>
+                <w:szCs w:val="20"/>
               </w:rPr>
               <w:t>Zona</w:t>
             </w:r>
@@ -476,7 +476,7 @@
         </w:tc>
         <w:tc>
           <w:tcPr>
-            <w:tcW w:w="838" w:type="dxa"/>
+            <w:tcW w:w="720" w:type="dxa"/>
             <w:tcBorders>
               <w:top w:val="single" w:sz="4" w:space="0" w:color="000000"/>
               <w:start w:val="single" w:sz="4" w:space="0" w:color="000000"/>
@@ -489,8 +489,8 @@
               <w:bidi w:val="0"/>
               <w:jc w:val="start"/>
               <w:rPr>
-                <w:sz w:val="22"/>
-                <w:szCs w:val="22"/>
+                <w:sz w:val="20"/>
+                <w:szCs w:val="20"/>
               </w:rPr>
             </w:pPr>
             <w:r>
@@ -498,8 +498,8 @@
                 <w:rFonts w:ascii="Times New Roman" w:hAnsi="Times New Roman"/>
                 <w:b/>
                 <w:bCs/>
-                <w:sz w:val="22"/>
-                <w:szCs w:val="22"/>
+                <w:sz w:val="20"/>
+                <w:szCs w:val="20"/>
               </w:rPr>
               <w:t>Centro</w:t>
             </w:r>
@@ -507,7 +507,7 @@
         </w:tc>
         <w:tc>
           <w:tcPr>
-            <w:tcW w:w="830" w:type="dxa"/>
+            <w:tcW w:w="720" w:type="dxa"/>
             <w:tcBorders>
               <w:top w:val="single" w:sz="4" w:space="0" w:color="000000"/>
               <w:start w:val="single" w:sz="4" w:space="0" w:color="000000"/>
@@ -520,8 +520,8 @@
               <w:bidi w:val="0"/>
               <w:jc w:val="start"/>
               <w:rPr>
-                <w:sz w:val="22"/>
-                <w:szCs w:val="22"/>
+                <w:sz w:val="20"/>
+                <w:szCs w:val="20"/>
               </w:rPr>
             </w:pPr>
             <w:r>
@@ -529,8 +529,8 @@
                 <w:rFonts w:ascii="Times New Roman" w:hAnsi="Times New Roman"/>
                 <w:b/>
                 <w:bCs/>
-                <w:sz w:val="22"/>
-                <w:szCs w:val="22"/>
+                <w:sz w:val="20"/>
+                <w:szCs w:val="20"/>
               </w:rPr>
               <w:t>Sector</w:t>
             </w:r>
@@ -538,7 +538,7 @@
         </w:tc>
         <w:tc>
           <w:tcPr>
-            <w:tcW w:w="1716" w:type="dxa"/>
+            <w:tcW w:w="1440" w:type="dxa"/>
             <w:tcBorders>
               <w:top w:val="single" w:sz="4" w:space="0" w:color="000000"/>
               <w:start w:val="single" w:sz="4" w:space="0" w:color="000000"/>
@@ -551,8 +551,8 @@
               <w:bidi w:val="0"/>
               <w:jc w:val="start"/>
               <w:rPr>
-                <w:sz w:val="22"/>
-                <w:szCs w:val="22"/>
+                <w:sz w:val="20"/>
+                <w:szCs w:val="20"/>
               </w:rPr>
             </w:pPr>
             <w:r>
@@ -560,8 +560,8 @@
                 <w:rFonts w:ascii="Times New Roman" w:hAnsi="Times New Roman"/>
                 <w:b/>
                 <w:bCs/>
-                <w:sz w:val="22"/>
-                <w:szCs w:val="22"/>
+                <w:sz w:val="20"/>
+                <w:szCs w:val="20"/>
               </w:rPr>
               <w:t>CUIL</w:t>
             </w:r>
@@ -569,7 +569,7 @@
         </w:tc>
         <w:tc>
           <w:tcPr>
-            <w:tcW w:w="2448" w:type="dxa"/>
+            <w:tcW w:w="3228" w:type="dxa"/>
             <w:tcBorders>
               <w:top w:val="single" w:sz="4" w:space="0" w:color="000000"/>
               <w:start w:val="single" w:sz="4" w:space="0" w:color="000000"/>
@@ -583,8 +583,8 @@
               <w:bidi w:val="0"/>
               <w:jc w:val="start"/>
               <w:rPr>
-                <w:sz w:val="22"/>
-                <w:szCs w:val="22"/>
+                <w:sz w:val="20"/>
+                <w:szCs w:val="20"/>
               </w:rPr>
             </w:pPr>
             <w:r>
@@ -592,8 +592,8 @@
                 <w:rFonts w:ascii="Times New Roman" w:hAnsi="Times New Roman"/>
                 <w:b/>
                 <w:bCs/>
-                <w:sz w:val="22"/>
-                <w:szCs w:val="22"/>
+                <w:sz w:val="20"/>
+                <w:szCs w:val="20"/>
               </w:rPr>
               <w:t>Motivo de baja</w:t>
             </w:r>
@@ -618,15 +618,15 @@
               <w:bidi w:val="0"/>
               <w:jc w:val="start"/>
               <w:rPr>
-                <w:sz w:val="22"/>
-                <w:szCs w:val="22"/>
-              </w:rPr>
-            </w:pPr>
-            <w:r>
-              <w:rPr>
-                <w:rFonts w:ascii="Times New Roman" w:hAnsi="Times New Roman"/>
-                <w:sz w:val="22"/>
-                <w:szCs w:val="22"/>
+                <w:sz w:val="20"/>
+                <w:szCs w:val="20"/>
+              </w:rPr>
+            </w:pPr>
+            <w:r>
+              <w:rPr>
+                <w:rFonts w:ascii="Times New Roman" w:hAnsi="Times New Roman"/>
+                <w:sz w:val="20"/>
+                <w:szCs w:val="20"/>
               </w:rPr>
               <w:t>{%tr for item in lista %}</w:t>
             </w:r>
@@ -647,15 +647,15 @@
               <w:jc w:val="start"/>
               <w:rPr>
                 <w:rFonts w:ascii="Times New Roman" w:hAnsi="Times New Roman"/>
-                <w:sz w:val="22"/>
-                <w:szCs w:val="22"/>
-              </w:rPr>
-            </w:pPr>
-            <w:r>
-              <w:rPr>
-                <w:rFonts w:ascii="Times New Roman" w:hAnsi="Times New Roman"/>
-                <w:sz w:val="22"/>
-                <w:szCs w:val="22"/>
+                <w:sz w:val="20"/>
+                <w:szCs w:val="20"/>
+              </w:rPr>
+            </w:pPr>
+            <w:r>
+              <w:rPr>
+                <w:rFonts w:ascii="Times New Roman" w:hAnsi="Times New Roman"/>
+                <w:sz w:val="20"/>
+                <w:szCs w:val="20"/>
               </w:rPr>
             </w:r>
           </w:p>
@@ -675,15 +675,15 @@
               <w:jc w:val="start"/>
               <w:rPr>
                 <w:rFonts w:ascii="Times New Roman" w:hAnsi="Times New Roman"/>
-                <w:sz w:val="22"/>
-                <w:szCs w:val="22"/>
-              </w:rPr>
-            </w:pPr>
-            <w:r>
-              <w:rPr>
-                <w:rFonts w:ascii="Times New Roman" w:hAnsi="Times New Roman"/>
-                <w:sz w:val="22"/>
-                <w:szCs w:val="22"/>
+                <w:sz w:val="20"/>
+                <w:szCs w:val="20"/>
+              </w:rPr>
+            </w:pPr>
+            <w:r>
+              <w:rPr>
+                <w:rFonts w:ascii="Times New Roman" w:hAnsi="Times New Roman"/>
+                <w:sz w:val="20"/>
+                <w:szCs w:val="20"/>
               </w:rPr>
             </w:r>
           </w:p>
@@ -703,15 +703,15 @@
               <w:jc w:val="start"/>
               <w:rPr>
                 <w:rFonts w:ascii="Times New Roman" w:hAnsi="Times New Roman"/>
-                <w:sz w:val="22"/>
-                <w:szCs w:val="22"/>
-              </w:rPr>
-            </w:pPr>
-            <w:r>
-              <w:rPr>
-                <w:rFonts w:ascii="Times New Roman" w:hAnsi="Times New Roman"/>
-                <w:sz w:val="22"/>
-                <w:szCs w:val="22"/>
+                <w:sz w:val="20"/>
+                <w:szCs w:val="20"/>
+              </w:rPr>
+            </w:pPr>
+            <w:r>
+              <w:rPr>
+                <w:rFonts w:ascii="Times New Roman" w:hAnsi="Times New Roman"/>
+                <w:sz w:val="20"/>
+                <w:szCs w:val="20"/>
               </w:rPr>
             </w:r>
           </w:p>
@@ -731,134 +731,134 @@
               <w:jc w:val="start"/>
               <w:rPr>
                 <w:rFonts w:ascii="Times New Roman" w:hAnsi="Times New Roman"/>
-                <w:sz w:val="22"/>
-                <w:szCs w:val="22"/>
-              </w:rPr>
-            </w:pPr>
-            <w:r>
-              <w:rPr>
-                <w:rFonts w:ascii="Times New Roman" w:hAnsi="Times New Roman"/>
-                <w:sz w:val="22"/>
-                <w:szCs w:val="22"/>
-              </w:rPr>
-            </w:r>
-          </w:p>
-        </w:tc>
-        <w:tc>
-          <w:tcPr>
-            <w:tcW w:w="855" w:type="dxa"/>
-            <w:tcBorders>
-              <w:start w:val="single" w:sz="4" w:space="0" w:color="000000"/>
-              <w:bottom w:val="single" w:sz="4" w:space="0" w:color="000000"/>
-            </w:tcBorders>
-          </w:tcPr>
-          <w:p>
-            <w:pPr>
-              <w:pStyle w:val="TableContents"/>
-              <w:bidi w:val="0"/>
-              <w:jc w:val="start"/>
-              <w:rPr>
-                <w:rFonts w:ascii="Times New Roman" w:hAnsi="Times New Roman"/>
-                <w:sz w:val="22"/>
-                <w:szCs w:val="22"/>
-              </w:rPr>
-            </w:pPr>
-            <w:r>
-              <w:rPr>
-                <w:rFonts w:ascii="Times New Roman" w:hAnsi="Times New Roman"/>
-                <w:sz w:val="22"/>
-                <w:szCs w:val="22"/>
-              </w:rPr>
-            </w:r>
-          </w:p>
-        </w:tc>
-        <w:tc>
-          <w:tcPr>
-            <w:tcW w:w="838" w:type="dxa"/>
-            <w:tcBorders>
-              <w:start w:val="single" w:sz="4" w:space="0" w:color="000000"/>
-              <w:bottom w:val="single" w:sz="4" w:space="0" w:color="000000"/>
-            </w:tcBorders>
-          </w:tcPr>
-          <w:p>
-            <w:pPr>
-              <w:pStyle w:val="TableContents"/>
-              <w:bidi w:val="0"/>
-              <w:jc w:val="start"/>
-              <w:rPr>
-                <w:rFonts w:ascii="Times New Roman" w:hAnsi="Times New Roman"/>
-                <w:sz w:val="22"/>
-                <w:szCs w:val="22"/>
-              </w:rPr>
-            </w:pPr>
-            <w:r>
-              <w:rPr>
-                <w:rFonts w:ascii="Times New Roman" w:hAnsi="Times New Roman"/>
-                <w:sz w:val="22"/>
-                <w:szCs w:val="22"/>
-              </w:rPr>
-            </w:r>
-          </w:p>
-        </w:tc>
-        <w:tc>
-          <w:tcPr>
-            <w:tcW w:w="830" w:type="dxa"/>
-            <w:tcBorders>
-              <w:start w:val="single" w:sz="4" w:space="0" w:color="000000"/>
-              <w:bottom w:val="single" w:sz="4" w:space="0" w:color="000000"/>
-            </w:tcBorders>
-          </w:tcPr>
-          <w:p>
-            <w:pPr>
-              <w:pStyle w:val="TableContents"/>
-              <w:bidi w:val="0"/>
-              <w:jc w:val="start"/>
-              <w:rPr>
-                <w:rFonts w:ascii="Times New Roman" w:hAnsi="Times New Roman"/>
-                <w:sz w:val="22"/>
-                <w:szCs w:val="22"/>
-              </w:rPr>
-            </w:pPr>
-            <w:r>
-              <w:rPr>
-                <w:rFonts w:ascii="Times New Roman" w:hAnsi="Times New Roman"/>
-                <w:sz w:val="22"/>
-                <w:szCs w:val="22"/>
-              </w:rPr>
-            </w:r>
-          </w:p>
-        </w:tc>
-        <w:tc>
-          <w:tcPr>
-            <w:tcW w:w="1716" w:type="dxa"/>
-            <w:tcBorders>
-              <w:start w:val="single" w:sz="4" w:space="0" w:color="000000"/>
-              <w:bottom w:val="single" w:sz="4" w:space="0" w:color="000000"/>
-            </w:tcBorders>
-          </w:tcPr>
-          <w:p>
-            <w:pPr>
-              <w:pStyle w:val="TableContents"/>
-              <w:bidi w:val="0"/>
-              <w:jc w:val="start"/>
-              <w:rPr>
-                <w:rFonts w:ascii="Times New Roman" w:hAnsi="Times New Roman"/>
-                <w:sz w:val="22"/>
-                <w:szCs w:val="22"/>
-              </w:rPr>
-            </w:pPr>
-            <w:r>
-              <w:rPr>
-                <w:rFonts w:ascii="Times New Roman" w:hAnsi="Times New Roman"/>
-                <w:sz w:val="22"/>
-                <w:szCs w:val="22"/>
-              </w:rPr>
-            </w:r>
-          </w:p>
-        </w:tc>
-        <w:tc>
-          <w:tcPr>
-            <w:tcW w:w="2448" w:type="dxa"/>
+                <w:sz w:val="20"/>
+                <w:szCs w:val="20"/>
+              </w:rPr>
+            </w:pPr>
+            <w:r>
+              <w:rPr>
+                <w:rFonts w:ascii="Times New Roman" w:hAnsi="Times New Roman"/>
+                <w:sz w:val="20"/>
+                <w:szCs w:val="20"/>
+              </w:rPr>
+            </w:r>
+          </w:p>
+        </w:tc>
+        <w:tc>
+          <w:tcPr>
+            <w:tcW w:w="579" w:type="dxa"/>
+            <w:tcBorders>
+              <w:start w:val="single" w:sz="4" w:space="0" w:color="000000"/>
+              <w:bottom w:val="single" w:sz="4" w:space="0" w:color="000000"/>
+            </w:tcBorders>
+          </w:tcPr>
+          <w:p>
+            <w:pPr>
+              <w:pStyle w:val="TableContents"/>
+              <w:bidi w:val="0"/>
+              <w:jc w:val="start"/>
+              <w:rPr>
+                <w:rFonts w:ascii="Times New Roman" w:hAnsi="Times New Roman"/>
+                <w:sz w:val="20"/>
+                <w:szCs w:val="20"/>
+              </w:rPr>
+            </w:pPr>
+            <w:r>
+              <w:rPr>
+                <w:rFonts w:ascii="Times New Roman" w:hAnsi="Times New Roman"/>
+                <w:sz w:val="20"/>
+                <w:szCs w:val="20"/>
+              </w:rPr>
+            </w:r>
+          </w:p>
+        </w:tc>
+        <w:tc>
+          <w:tcPr>
+            <w:tcW w:w="720" w:type="dxa"/>
+            <w:tcBorders>
+              <w:start w:val="single" w:sz="4" w:space="0" w:color="000000"/>
+              <w:bottom w:val="single" w:sz="4" w:space="0" w:color="000000"/>
+            </w:tcBorders>
+          </w:tcPr>
+          <w:p>
+            <w:pPr>
+              <w:pStyle w:val="TableContents"/>
+              <w:bidi w:val="0"/>
+              <w:jc w:val="start"/>
+              <w:rPr>
+                <w:rFonts w:ascii="Times New Roman" w:hAnsi="Times New Roman"/>
+                <w:sz w:val="20"/>
+                <w:szCs w:val="20"/>
+              </w:rPr>
+            </w:pPr>
+            <w:r>
+              <w:rPr>
+                <w:rFonts w:ascii="Times New Roman" w:hAnsi="Times New Roman"/>
+                <w:sz w:val="20"/>
+                <w:szCs w:val="20"/>
+              </w:rPr>
+            </w:r>
+          </w:p>
+        </w:tc>
+        <w:tc>
+          <w:tcPr>
+            <w:tcW w:w="720" w:type="dxa"/>
+            <w:tcBorders>
+              <w:start w:val="single" w:sz="4" w:space="0" w:color="000000"/>
+              <w:bottom w:val="single" w:sz="4" w:space="0" w:color="000000"/>
+            </w:tcBorders>
+          </w:tcPr>
+          <w:p>
+            <w:pPr>
+              <w:pStyle w:val="TableContents"/>
+              <w:bidi w:val="0"/>
+              <w:jc w:val="start"/>
+              <w:rPr>
+                <w:rFonts w:ascii="Times New Roman" w:hAnsi="Times New Roman"/>
+                <w:sz w:val="20"/>
+                <w:szCs w:val="20"/>
+              </w:rPr>
+            </w:pPr>
+            <w:r>
+              <w:rPr>
+                <w:rFonts w:ascii="Times New Roman" w:hAnsi="Times New Roman"/>
+                <w:sz w:val="20"/>
+                <w:szCs w:val="20"/>
+              </w:rPr>
+            </w:r>
+          </w:p>
+        </w:tc>
+        <w:tc>
+          <w:tcPr>
+            <w:tcW w:w="1440" w:type="dxa"/>
+            <w:tcBorders>
+              <w:start w:val="single" w:sz="4" w:space="0" w:color="000000"/>
+              <w:bottom w:val="single" w:sz="4" w:space="0" w:color="000000"/>
+            </w:tcBorders>
+          </w:tcPr>
+          <w:p>
+            <w:pPr>
+              <w:pStyle w:val="TableContents"/>
+              <w:bidi w:val="0"/>
+              <w:jc w:val="start"/>
+              <w:rPr>
+                <w:rFonts w:ascii="Times New Roman" w:hAnsi="Times New Roman"/>
+                <w:sz w:val="20"/>
+                <w:szCs w:val="20"/>
+              </w:rPr>
+            </w:pPr>
+            <w:r>
+              <w:rPr>
+                <w:rFonts w:ascii="Times New Roman" w:hAnsi="Times New Roman"/>
+                <w:sz w:val="20"/>
+                <w:szCs w:val="20"/>
+              </w:rPr>
+            </w:r>
+          </w:p>
+        </w:tc>
+        <w:tc>
+          <w:tcPr>
+            <w:tcW w:w="3228" w:type="dxa"/>
             <w:tcBorders>
               <w:start w:val="single" w:sz="4" w:space="0" w:color="000000"/>
               <w:bottom w:val="single" w:sz="4" w:space="0" w:color="000000"/>
@@ -872,15 +872,15 @@
               <w:jc w:val="start"/>
               <w:rPr>
                 <w:rFonts w:ascii="Times New Roman" w:hAnsi="Times New Roman"/>
-                <w:sz w:val="22"/>
-                <w:szCs w:val="22"/>
-              </w:rPr>
-            </w:pPr>
-            <w:r>
-              <w:rPr>
-                <w:rFonts w:ascii="Times New Roman" w:hAnsi="Times New Roman"/>
-                <w:sz w:val="22"/>
-                <w:szCs w:val="22"/>
+                <w:sz w:val="20"/>
+                <w:szCs w:val="20"/>
+              </w:rPr>
+            </w:pPr>
+            <w:r>
+              <w:rPr>
+                <w:rFonts w:ascii="Times New Roman" w:hAnsi="Times New Roman"/>
+                <w:sz w:val="20"/>
+                <w:szCs w:val="20"/>
               </w:rPr>
             </w:r>
           </w:p>
@@ -904,15 +904,15 @@
               <w:bidi w:val="0"/>
               <w:jc w:val="start"/>
               <w:rPr>
-                <w:sz w:val="22"/>
-                <w:szCs w:val="22"/>
-              </w:rPr>
-            </w:pPr>
-            <w:r>
-              <w:rPr>
-                <w:rFonts w:ascii="Times New Roman" w:hAnsi="Times New Roman"/>
-                <w:sz w:val="22"/>
-                <w:szCs w:val="22"/>
+                <w:sz w:val="20"/>
+                <w:szCs w:val="20"/>
+              </w:rPr>
+            </w:pPr>
+            <w:r>
+              <w:rPr>
+                <w:rFonts w:ascii="Times New Roman" w:hAnsi="Times New Roman"/>
+                <w:sz w:val="20"/>
+                <w:szCs w:val="20"/>
                 <w:lang w:val="es-AR"/>
               </w:rPr>
               <w:t>{{item.padron}}</w:t>
@@ -933,15 +933,15 @@
               <w:bidi w:val="0"/>
               <w:jc w:val="start"/>
               <w:rPr>
-                <w:sz w:val="22"/>
-                <w:szCs w:val="22"/>
-              </w:rPr>
-            </w:pPr>
-            <w:r>
-              <w:rPr>
-                <w:rFonts w:ascii="Times New Roman" w:hAnsi="Times New Roman"/>
-                <w:sz w:val="22"/>
-                <w:szCs w:val="22"/>
+                <w:sz w:val="20"/>
+                <w:szCs w:val="20"/>
+              </w:rPr>
+            </w:pPr>
+            <w:r>
+              <w:rPr>
+                <w:rFonts w:ascii="Times New Roman" w:hAnsi="Times New Roman"/>
+                <w:sz w:val="20"/>
+                <w:szCs w:val="20"/>
               </w:rPr>
               <w:t>{{item.beneficiario_nombre}}</w:t>
             </w:r>
@@ -961,15 +961,15 @@
               <w:bidi w:val="0"/>
               <w:jc w:val="start"/>
               <w:rPr>
-                <w:sz w:val="22"/>
-                <w:szCs w:val="22"/>
-              </w:rPr>
-            </w:pPr>
-            <w:r>
-              <w:rPr>
-                <w:rFonts w:ascii="Times New Roman" w:hAnsi="Times New Roman"/>
-                <w:sz w:val="22"/>
-                <w:szCs w:val="22"/>
+                <w:sz w:val="20"/>
+                <w:szCs w:val="20"/>
+              </w:rPr>
+            </w:pPr>
+            <w:r>
+              <w:rPr>
+                <w:rFonts w:ascii="Times New Roman" w:hAnsi="Times New Roman"/>
+                <w:sz w:val="20"/>
+                <w:szCs w:val="20"/>
               </w:rPr>
               <w:t>{{item.importe}}</w:t>
             </w:r>
@@ -989,15 +989,15 @@
               <w:bidi w:val="0"/>
               <w:jc w:val="start"/>
               <w:rPr>
-                <w:sz w:val="22"/>
-                <w:szCs w:val="22"/>
-              </w:rPr>
-            </w:pPr>
-            <w:r>
-              <w:rPr>
-                <w:rFonts w:ascii="Times New Roman" w:hAnsi="Times New Roman"/>
-                <w:sz w:val="22"/>
-                <w:szCs w:val="22"/>
+                <w:sz w:val="20"/>
+                <w:szCs w:val="20"/>
+              </w:rPr>
+            </w:pPr>
+            <w:r>
+              <w:rPr>
+                <w:rFonts w:ascii="Times New Roman" w:hAnsi="Times New Roman"/>
+                <w:sz w:val="20"/>
+                <w:szCs w:val="20"/>
               </w:rPr>
               <w:t>{{item.cuenta_debito}}</w:t>
             </w:r>
@@ -1017,15 +1017,15 @@
               <w:bidi w:val="0"/>
               <w:jc w:val="start"/>
               <w:rPr>
-                <w:sz w:val="22"/>
-                <w:szCs w:val="22"/>
-              </w:rPr>
-            </w:pPr>
-            <w:r>
-              <w:rPr>
-                <w:rFonts w:ascii="Times New Roman" w:hAnsi="Times New Roman"/>
-                <w:sz w:val="22"/>
-                <w:szCs w:val="22"/>
+                <w:sz w:val="20"/>
+                <w:szCs w:val="20"/>
+              </w:rPr>
+            </w:pPr>
+            <w:r>
+              <w:rPr>
+                <w:rFonts w:ascii="Times New Roman" w:hAnsi="Times New Roman"/>
+                <w:sz w:val="20"/>
+                <w:szCs w:val="20"/>
               </w:rPr>
               <w:t>{{item.cuenta_acreditacion}}</w:t>
             </w:r>
@@ -1033,27 +1033,27 @@
         </w:tc>
         <w:tc>
           <w:tcPr>
-            <w:tcW w:w="855" w:type="dxa"/>
-            <w:tcBorders>
-              <w:start w:val="single" w:sz="4" w:space="0" w:color="000000"/>
-              <w:bottom w:val="single" w:sz="4" w:space="0" w:color="000000"/>
-            </w:tcBorders>
-          </w:tcPr>
-          <w:p>
-            <w:pPr>
-              <w:pStyle w:val="TableContents"/>
-              <w:bidi w:val="0"/>
-              <w:jc w:val="start"/>
-              <w:rPr>
-                <w:sz w:val="22"/>
-                <w:szCs w:val="22"/>
-              </w:rPr>
-            </w:pPr>
-            <w:r>
-              <w:rPr>
-                <w:rFonts w:ascii="Times New Roman" w:hAnsi="Times New Roman"/>
-                <w:sz w:val="22"/>
-                <w:szCs w:val="22"/>
+            <w:tcW w:w="579" w:type="dxa"/>
+            <w:tcBorders>
+              <w:start w:val="single" w:sz="4" w:space="0" w:color="000000"/>
+              <w:bottom w:val="single" w:sz="4" w:space="0" w:color="000000"/>
+            </w:tcBorders>
+          </w:tcPr>
+          <w:p>
+            <w:pPr>
+              <w:pStyle w:val="TableContents"/>
+              <w:bidi w:val="0"/>
+              <w:jc w:val="start"/>
+              <w:rPr>
+                <w:sz w:val="20"/>
+                <w:szCs w:val="20"/>
+              </w:rPr>
+            </w:pPr>
+            <w:r>
+              <w:rPr>
+                <w:rFonts w:ascii="Times New Roman" w:hAnsi="Times New Roman"/>
+                <w:sz w:val="20"/>
+                <w:szCs w:val="20"/>
               </w:rPr>
               <w:t>{{item.zona}}</w:t>
             </w:r>
@@ -1061,27 +1061,27 @@
         </w:tc>
         <w:tc>
           <w:tcPr>
-            <w:tcW w:w="838" w:type="dxa"/>
-            <w:tcBorders>
-              <w:start w:val="single" w:sz="4" w:space="0" w:color="000000"/>
-              <w:bottom w:val="single" w:sz="4" w:space="0" w:color="000000"/>
-            </w:tcBorders>
-          </w:tcPr>
-          <w:p>
-            <w:pPr>
-              <w:pStyle w:val="TableContents"/>
-              <w:bidi w:val="0"/>
-              <w:jc w:val="start"/>
-              <w:rPr>
-                <w:sz w:val="22"/>
-                <w:szCs w:val="22"/>
-              </w:rPr>
-            </w:pPr>
-            <w:r>
-              <w:rPr>
-                <w:rFonts w:ascii="Times New Roman" w:hAnsi="Times New Roman"/>
-                <w:sz w:val="22"/>
-                <w:szCs w:val="22"/>
+            <w:tcW w:w="720" w:type="dxa"/>
+            <w:tcBorders>
+              <w:start w:val="single" w:sz="4" w:space="0" w:color="000000"/>
+              <w:bottom w:val="single" w:sz="4" w:space="0" w:color="000000"/>
+            </w:tcBorders>
+          </w:tcPr>
+          <w:p>
+            <w:pPr>
+              <w:pStyle w:val="TableContents"/>
+              <w:bidi w:val="0"/>
+              <w:jc w:val="start"/>
+              <w:rPr>
+                <w:sz w:val="20"/>
+                <w:szCs w:val="20"/>
+              </w:rPr>
+            </w:pPr>
+            <w:r>
+              <w:rPr>
+                <w:rFonts w:ascii="Times New Roman" w:hAnsi="Times New Roman"/>
+                <w:sz w:val="20"/>
+                <w:szCs w:val="20"/>
               </w:rPr>
               <w:t>{{item.centro}}</w:t>
             </w:r>
@@ -1089,27 +1089,27 @@
         </w:tc>
         <w:tc>
           <w:tcPr>
-            <w:tcW w:w="830" w:type="dxa"/>
-            <w:tcBorders>
-              <w:start w:val="single" w:sz="4" w:space="0" w:color="000000"/>
-              <w:bottom w:val="single" w:sz="4" w:space="0" w:color="000000"/>
-            </w:tcBorders>
-          </w:tcPr>
-          <w:p>
-            <w:pPr>
-              <w:pStyle w:val="TableContents"/>
-              <w:bidi w:val="0"/>
-              <w:jc w:val="start"/>
-              <w:rPr>
-                <w:sz w:val="22"/>
-                <w:szCs w:val="22"/>
-              </w:rPr>
-            </w:pPr>
-            <w:r>
-              <w:rPr>
-                <w:rFonts w:ascii="Times New Roman" w:hAnsi="Times New Roman"/>
-                <w:sz w:val="22"/>
-                <w:szCs w:val="22"/>
+            <w:tcW w:w="720" w:type="dxa"/>
+            <w:tcBorders>
+              <w:start w:val="single" w:sz="4" w:space="0" w:color="000000"/>
+              <w:bottom w:val="single" w:sz="4" w:space="0" w:color="000000"/>
+            </w:tcBorders>
+          </w:tcPr>
+          <w:p>
+            <w:pPr>
+              <w:pStyle w:val="TableContents"/>
+              <w:bidi w:val="0"/>
+              <w:jc w:val="start"/>
+              <w:rPr>
+                <w:sz w:val="20"/>
+                <w:szCs w:val="20"/>
+              </w:rPr>
+            </w:pPr>
+            <w:r>
+              <w:rPr>
+                <w:rFonts w:ascii="Times New Roman" w:hAnsi="Times New Roman"/>
+                <w:sz w:val="20"/>
+                <w:szCs w:val="20"/>
               </w:rPr>
               <w:t>{{item.sector}}</w:t>
             </w:r>
@@ -1117,27 +1117,27 @@
         </w:tc>
         <w:tc>
           <w:tcPr>
-            <w:tcW w:w="1716" w:type="dxa"/>
-            <w:tcBorders>
-              <w:start w:val="single" w:sz="4" w:space="0" w:color="000000"/>
-              <w:bottom w:val="single" w:sz="4" w:space="0" w:color="000000"/>
-            </w:tcBorders>
-          </w:tcPr>
-          <w:p>
-            <w:pPr>
-              <w:pStyle w:val="TableContents"/>
-              <w:bidi w:val="0"/>
-              <w:jc w:val="start"/>
-              <w:rPr>
-                <w:sz w:val="22"/>
-                <w:szCs w:val="22"/>
-              </w:rPr>
-            </w:pPr>
-            <w:r>
-              <w:rPr>
-                <w:rFonts w:ascii="Times New Roman" w:hAnsi="Times New Roman"/>
-                <w:sz w:val="22"/>
-                <w:szCs w:val="22"/>
+            <w:tcW w:w="1440" w:type="dxa"/>
+            <w:tcBorders>
+              <w:start w:val="single" w:sz="4" w:space="0" w:color="000000"/>
+              <w:bottom w:val="single" w:sz="4" w:space="0" w:color="000000"/>
+            </w:tcBorders>
+          </w:tcPr>
+          <w:p>
+            <w:pPr>
+              <w:pStyle w:val="TableContents"/>
+              <w:bidi w:val="0"/>
+              <w:jc w:val="start"/>
+              <w:rPr>
+                <w:sz w:val="20"/>
+                <w:szCs w:val="20"/>
+              </w:rPr>
+            </w:pPr>
+            <w:r>
+              <w:rPr>
+                <w:rFonts w:ascii="Times New Roman" w:hAnsi="Times New Roman"/>
+                <w:sz w:val="20"/>
+                <w:szCs w:val="20"/>
               </w:rPr>
               <w:t>{{item.cuil}}</w:t>
             </w:r>
@@ -1145,7 +1145,7 @@
         </w:tc>
         <w:tc>
           <w:tcPr>
-            <w:tcW w:w="2448" w:type="dxa"/>
+            <w:tcW w:w="3228" w:type="dxa"/>
             <w:tcBorders>
               <w:start w:val="single" w:sz="4" w:space="0" w:color="000000"/>
               <w:bottom w:val="single" w:sz="4" w:space="0" w:color="000000"/>
@@ -1159,15 +1159,15 @@
               <w:spacing w:lineRule="auto" w:line="240" w:before="0" w:after="0"/>
               <w:jc w:val="start"/>
               <w:rPr>
-                <w:sz w:val="22"/>
-                <w:szCs w:val="22"/>
-              </w:rPr>
-            </w:pPr>
-            <w:r>
-              <w:rPr>
-                <w:rFonts w:ascii="Times New Roman" w:hAnsi="Times New Roman"/>
-                <w:sz w:val="22"/>
-                <w:szCs w:val="22"/>
+                <w:sz w:val="20"/>
+                <w:szCs w:val="20"/>
+              </w:rPr>
+            </w:pPr>
+            <w:r>
+              <w:rPr>
+                <w:rFonts w:ascii="Times New Roman" w:hAnsi="Times New Roman"/>
+                <w:sz w:val="20"/>
+                <w:szCs w:val="20"/>
                 <w:lang w:val="es-AR"/>
               </w:rPr>
               <w:t>{{item.motivo}}</w:t>
@@ -1193,15 +1193,15 @@
               <w:bidi w:val="0"/>
               <w:jc w:val="start"/>
               <w:rPr>
-                <w:sz w:val="22"/>
-                <w:szCs w:val="22"/>
-              </w:rPr>
-            </w:pPr>
-            <w:r>
-              <w:rPr>
-                <w:rFonts w:ascii="Times New Roman" w:hAnsi="Times New Roman"/>
-                <w:sz w:val="22"/>
-                <w:szCs w:val="22"/>
+                <w:sz w:val="20"/>
+                <w:szCs w:val="20"/>
+              </w:rPr>
+            </w:pPr>
+            <w:r>
+              <w:rPr>
+                <w:rFonts w:ascii="Times New Roman" w:hAnsi="Times New Roman"/>
+                <w:sz w:val="20"/>
+                <w:szCs w:val="20"/>
                 <w:lang w:val="es-AR"/>
               </w:rPr>
               <w:t>{%tr endfor %}</w:t>
@@ -1223,15 +1223,15 @@
               <w:jc w:val="start"/>
               <w:rPr>
                 <w:rFonts w:ascii="Times New Roman" w:hAnsi="Times New Roman"/>
-                <w:sz w:val="22"/>
-                <w:szCs w:val="22"/>
-              </w:rPr>
-            </w:pPr>
-            <w:r>
-              <w:rPr>
-                <w:rFonts w:ascii="Times New Roman" w:hAnsi="Times New Roman"/>
-                <w:sz w:val="22"/>
-                <w:szCs w:val="22"/>
+                <w:sz w:val="20"/>
+                <w:szCs w:val="20"/>
+              </w:rPr>
+            </w:pPr>
+            <w:r>
+              <w:rPr>
+                <w:rFonts w:ascii="Times New Roman" w:hAnsi="Times New Roman"/>
+                <w:sz w:val="20"/>
+                <w:szCs w:val="20"/>
               </w:rPr>
             </w:r>
           </w:p>
@@ -1251,15 +1251,15 @@
               <w:jc w:val="start"/>
               <w:rPr>
                 <w:rFonts w:ascii="Times New Roman" w:hAnsi="Times New Roman"/>
-                <w:sz w:val="22"/>
-                <w:szCs w:val="22"/>
-              </w:rPr>
-            </w:pPr>
-            <w:r>
-              <w:rPr>
-                <w:rFonts w:ascii="Times New Roman" w:hAnsi="Times New Roman"/>
-                <w:sz w:val="22"/>
-                <w:szCs w:val="22"/>
+                <w:sz w:val="20"/>
+                <w:szCs w:val="20"/>
+              </w:rPr>
+            </w:pPr>
+            <w:r>
+              <w:rPr>
+                <w:rFonts w:ascii="Times New Roman" w:hAnsi="Times New Roman"/>
+                <w:sz w:val="20"/>
+                <w:szCs w:val="20"/>
               </w:rPr>
             </w:r>
           </w:p>
@@ -1279,15 +1279,15 @@
               <w:jc w:val="start"/>
               <w:rPr>
                 <w:rFonts w:ascii="Times New Roman" w:hAnsi="Times New Roman"/>
-                <w:sz w:val="22"/>
-                <w:szCs w:val="22"/>
-              </w:rPr>
-            </w:pPr>
-            <w:r>
-              <w:rPr>
-                <w:rFonts w:ascii="Times New Roman" w:hAnsi="Times New Roman"/>
-                <w:sz w:val="22"/>
-                <w:szCs w:val="22"/>
+                <w:sz w:val="20"/>
+                <w:szCs w:val="20"/>
+              </w:rPr>
+            </w:pPr>
+            <w:r>
+              <w:rPr>
+                <w:rFonts w:ascii="Times New Roman" w:hAnsi="Times New Roman"/>
+                <w:sz w:val="20"/>
+                <w:szCs w:val="20"/>
               </w:rPr>
             </w:r>
           </w:p>
@@ -1307,134 +1307,134 @@
               <w:jc w:val="start"/>
               <w:rPr>
                 <w:rFonts w:ascii="Times New Roman" w:hAnsi="Times New Roman"/>
-                <w:sz w:val="22"/>
-                <w:szCs w:val="22"/>
-              </w:rPr>
-            </w:pPr>
-            <w:r>
-              <w:rPr>
-                <w:rFonts w:ascii="Times New Roman" w:hAnsi="Times New Roman"/>
-                <w:sz w:val="22"/>
-                <w:szCs w:val="22"/>
-              </w:rPr>
-            </w:r>
-          </w:p>
-        </w:tc>
-        <w:tc>
-          <w:tcPr>
-            <w:tcW w:w="855" w:type="dxa"/>
-            <w:tcBorders>
-              <w:start w:val="single" w:sz="4" w:space="0" w:color="000000"/>
-              <w:bottom w:val="single" w:sz="4" w:space="0" w:color="000000"/>
-            </w:tcBorders>
-          </w:tcPr>
-          <w:p>
-            <w:pPr>
-              <w:pStyle w:val="TableContents"/>
-              <w:bidi w:val="0"/>
-              <w:jc w:val="start"/>
-              <w:rPr>
-                <w:rFonts w:ascii="Times New Roman" w:hAnsi="Times New Roman"/>
-                <w:sz w:val="22"/>
-                <w:szCs w:val="22"/>
-              </w:rPr>
-            </w:pPr>
-            <w:r>
-              <w:rPr>
-                <w:rFonts w:ascii="Times New Roman" w:hAnsi="Times New Roman"/>
-                <w:sz w:val="22"/>
-                <w:szCs w:val="22"/>
-              </w:rPr>
-            </w:r>
-          </w:p>
-        </w:tc>
-        <w:tc>
-          <w:tcPr>
-            <w:tcW w:w="838" w:type="dxa"/>
-            <w:tcBorders>
-              <w:start w:val="single" w:sz="4" w:space="0" w:color="000000"/>
-              <w:bottom w:val="single" w:sz="4" w:space="0" w:color="000000"/>
-            </w:tcBorders>
-          </w:tcPr>
-          <w:p>
-            <w:pPr>
-              <w:pStyle w:val="TableContents"/>
-              <w:bidi w:val="0"/>
-              <w:jc w:val="start"/>
-              <w:rPr>
-                <w:rFonts w:ascii="Times New Roman" w:hAnsi="Times New Roman"/>
-                <w:sz w:val="22"/>
-                <w:szCs w:val="22"/>
-              </w:rPr>
-            </w:pPr>
-            <w:r>
-              <w:rPr>
-                <w:rFonts w:ascii="Times New Roman" w:hAnsi="Times New Roman"/>
-                <w:sz w:val="22"/>
-                <w:szCs w:val="22"/>
-              </w:rPr>
-            </w:r>
-          </w:p>
-        </w:tc>
-        <w:tc>
-          <w:tcPr>
-            <w:tcW w:w="830" w:type="dxa"/>
-            <w:tcBorders>
-              <w:start w:val="single" w:sz="4" w:space="0" w:color="000000"/>
-              <w:bottom w:val="single" w:sz="4" w:space="0" w:color="000000"/>
-            </w:tcBorders>
-          </w:tcPr>
-          <w:p>
-            <w:pPr>
-              <w:pStyle w:val="TableContents"/>
-              <w:bidi w:val="0"/>
-              <w:jc w:val="start"/>
-              <w:rPr>
-                <w:rFonts w:ascii="Times New Roman" w:hAnsi="Times New Roman"/>
-                <w:sz w:val="22"/>
-                <w:szCs w:val="22"/>
-              </w:rPr>
-            </w:pPr>
-            <w:r>
-              <w:rPr>
-                <w:rFonts w:ascii="Times New Roman" w:hAnsi="Times New Roman"/>
-                <w:sz w:val="22"/>
-                <w:szCs w:val="22"/>
-              </w:rPr>
-            </w:r>
-          </w:p>
-        </w:tc>
-        <w:tc>
-          <w:tcPr>
-            <w:tcW w:w="1716" w:type="dxa"/>
-            <w:tcBorders>
-              <w:start w:val="single" w:sz="4" w:space="0" w:color="000000"/>
-              <w:bottom w:val="single" w:sz="4" w:space="0" w:color="000000"/>
-            </w:tcBorders>
-          </w:tcPr>
-          <w:p>
-            <w:pPr>
-              <w:pStyle w:val="TableContents"/>
-              <w:bidi w:val="0"/>
-              <w:jc w:val="start"/>
-              <w:rPr>
-                <w:rFonts w:ascii="Times New Roman" w:hAnsi="Times New Roman"/>
-                <w:sz w:val="22"/>
-                <w:szCs w:val="22"/>
-              </w:rPr>
-            </w:pPr>
-            <w:r>
-              <w:rPr>
-                <w:rFonts w:ascii="Times New Roman" w:hAnsi="Times New Roman"/>
-                <w:sz w:val="22"/>
-                <w:szCs w:val="22"/>
-              </w:rPr>
-            </w:r>
-          </w:p>
-        </w:tc>
-        <w:tc>
-          <w:tcPr>
-            <w:tcW w:w="2448" w:type="dxa"/>
+                <w:sz w:val="20"/>
+                <w:szCs w:val="20"/>
+              </w:rPr>
+            </w:pPr>
+            <w:r>
+              <w:rPr>
+                <w:rFonts w:ascii="Times New Roman" w:hAnsi="Times New Roman"/>
+                <w:sz w:val="20"/>
+                <w:szCs w:val="20"/>
+              </w:rPr>
+            </w:r>
+          </w:p>
+        </w:tc>
+        <w:tc>
+          <w:tcPr>
+            <w:tcW w:w="579" w:type="dxa"/>
+            <w:tcBorders>
+              <w:start w:val="single" w:sz="4" w:space="0" w:color="000000"/>
+              <w:bottom w:val="single" w:sz="4" w:space="0" w:color="000000"/>
+            </w:tcBorders>
+          </w:tcPr>
+          <w:p>
+            <w:pPr>
+              <w:pStyle w:val="TableContents"/>
+              <w:bidi w:val="0"/>
+              <w:jc w:val="start"/>
+              <w:rPr>
+                <w:rFonts w:ascii="Times New Roman" w:hAnsi="Times New Roman"/>
+                <w:sz w:val="20"/>
+                <w:szCs w:val="20"/>
+              </w:rPr>
+            </w:pPr>
+            <w:r>
+              <w:rPr>
+                <w:rFonts w:ascii="Times New Roman" w:hAnsi="Times New Roman"/>
+                <w:sz w:val="20"/>
+                <w:szCs w:val="20"/>
+              </w:rPr>
+            </w:r>
+          </w:p>
+        </w:tc>
+        <w:tc>
+          <w:tcPr>
+            <w:tcW w:w="720" w:type="dxa"/>
+            <w:tcBorders>
+              <w:start w:val="single" w:sz="4" w:space="0" w:color="000000"/>
+              <w:bottom w:val="single" w:sz="4" w:space="0" w:color="000000"/>
+            </w:tcBorders>
+          </w:tcPr>
+          <w:p>
+            <w:pPr>
+              <w:pStyle w:val="TableContents"/>
+              <w:bidi w:val="0"/>
+              <w:jc w:val="start"/>
+              <w:rPr>
+                <w:rFonts w:ascii="Times New Roman" w:hAnsi="Times New Roman"/>
+                <w:sz w:val="20"/>
+                <w:szCs w:val="20"/>
+              </w:rPr>
+            </w:pPr>
+            <w:r>
+              <w:rPr>
+                <w:rFonts w:ascii="Times New Roman" w:hAnsi="Times New Roman"/>
+                <w:sz w:val="20"/>
+                <w:szCs w:val="20"/>
+              </w:rPr>
+            </w:r>
+          </w:p>
+        </w:tc>
+        <w:tc>
+          <w:tcPr>
+            <w:tcW w:w="720" w:type="dxa"/>
+            <w:tcBorders>
+              <w:start w:val="single" w:sz="4" w:space="0" w:color="000000"/>
+              <w:bottom w:val="single" w:sz="4" w:space="0" w:color="000000"/>
+            </w:tcBorders>
+          </w:tcPr>
+          <w:p>
+            <w:pPr>
+              <w:pStyle w:val="TableContents"/>
+              <w:bidi w:val="0"/>
+              <w:jc w:val="start"/>
+              <w:rPr>
+                <w:rFonts w:ascii="Times New Roman" w:hAnsi="Times New Roman"/>
+                <w:sz w:val="20"/>
+                <w:szCs w:val="20"/>
+              </w:rPr>
+            </w:pPr>
+            <w:r>
+              <w:rPr>
+                <w:rFonts w:ascii="Times New Roman" w:hAnsi="Times New Roman"/>
+                <w:sz w:val="20"/>
+                <w:szCs w:val="20"/>
+              </w:rPr>
+            </w:r>
+          </w:p>
+        </w:tc>
+        <w:tc>
+          <w:tcPr>
+            <w:tcW w:w="1440" w:type="dxa"/>
+            <w:tcBorders>
+              <w:start w:val="single" w:sz="4" w:space="0" w:color="000000"/>
+              <w:bottom w:val="single" w:sz="4" w:space="0" w:color="000000"/>
+            </w:tcBorders>
+          </w:tcPr>
+          <w:p>
+            <w:pPr>
+              <w:pStyle w:val="TableContents"/>
+              <w:bidi w:val="0"/>
+              <w:jc w:val="start"/>
+              <w:rPr>
+                <w:rFonts w:ascii="Times New Roman" w:hAnsi="Times New Roman"/>
+                <w:sz w:val="20"/>
+                <w:szCs w:val="20"/>
+              </w:rPr>
+            </w:pPr>
+            <w:r>
+              <w:rPr>
+                <w:rFonts w:ascii="Times New Roman" w:hAnsi="Times New Roman"/>
+                <w:sz w:val="20"/>
+                <w:szCs w:val="20"/>
+              </w:rPr>
+            </w:r>
+          </w:p>
+        </w:tc>
+        <w:tc>
+          <w:tcPr>
+            <w:tcW w:w="3228" w:type="dxa"/>
             <w:tcBorders>
               <w:start w:val="single" w:sz="4" w:space="0" w:color="000000"/>
               <w:bottom w:val="single" w:sz="4" w:space="0" w:color="000000"/>
@@ -1449,16 +1449,16 @@
               <w:jc w:val="start"/>
               <w:rPr>
                 <w:rFonts w:ascii="Times New Roman" w:hAnsi="Times New Roman"/>
-                <w:sz w:val="22"/>
-                <w:szCs w:val="22"/>
+                <w:sz w:val="20"/>
+                <w:szCs w:val="20"/>
                 <w:lang w:val="es-AR"/>
               </w:rPr>
             </w:pPr>
             <w:r>
               <w:rPr>
                 <w:rFonts w:ascii="Times New Roman" w:hAnsi="Times New Roman"/>
-                <w:sz w:val="22"/>
-                <w:szCs w:val="22"/>
+                <w:sz w:val="20"/>
+                <w:szCs w:val="20"/>
                 <w:lang w:val="es-AR"/>
               </w:rPr>
             </w:r>
@@ -1516,16 +1516,16 @@
             <w:pPr>
               <w:pStyle w:val="TableContents"/>
               <w:rPr>
-                <w:sz w:val="22"/>
-                <w:szCs w:val="22"/>
+                <w:sz w:val="20"/>
+                <w:szCs w:val="20"/>
               </w:rPr>
             </w:pPr>
             <w:r>
               <w:rPr>
                 <w:b/>
                 <w:bCs/>
-                <w:sz w:val="22"/>
-                <w:szCs w:val="22"/>
+                <w:sz w:val="20"/>
+                <w:szCs w:val="20"/>
               </w:rPr>
               <w:t>TOTAL</w:t>
             </w:r>
@@ -1546,14 +1546,14 @@
               <w:pStyle w:val="TableContents"/>
               <w:jc w:val="end"/>
               <w:rPr>
-                <w:sz w:val="22"/>
-                <w:szCs w:val="22"/>
-              </w:rPr>
-            </w:pPr>
-            <w:r>
-              <w:rPr>
-                <w:sz w:val="22"/>
-                <w:szCs w:val="22"/>
+                <w:sz w:val="20"/>
+                <w:szCs w:val="20"/>
+              </w:rPr>
+            </w:pPr>
+            <w:r>
+              <w:rPr>
+                <w:sz w:val="20"/>
+                <w:szCs w:val="20"/>
               </w:rPr>
               <w:t xml:space="preserve"> </w:t>
             </w:r>
@@ -1561,8 +1561,8 @@
               <w:rPr>
                 <w:b/>
                 <w:bCs/>
-                <w:sz w:val="22"/>
-                <w:szCs w:val="22"/>
+                <w:sz w:val="20"/>
+                <w:szCs w:val="20"/>
               </w:rPr>
               <w:t>{{ importe_total }}</w:t>
             </w:r>

</xml_diff>